<commit_message>
第 18 章加 summon:broker2 以 CyberArk 官方 summon + summon-conjur 取主金鑰(Lab 18.20),手冊 v2 重產
- scripts/secret-protection.sh summon-setup / apply-summon;docker-compose.cyberark-summon.yml、config/conjur/{conjur.conf,secrets-broker.yml}
- 實測:PID 1 = summon → java;主金鑰只在 java 程序環境;錯 API key 401 不啟動;gary 經 broker2 登入 200
- 踩坑:Docker Desktop 單檔 bind mount 時 summon-conjur 讀不到 netrc,改掛目錄 + conjur.conf netrc_path
- ch18 23 步 0 失敗;verify-doc Lab 18 共 22 步 0 不符合(18.1 判定式改 credential);RUNBOOK、DESIGN-BASIS、附錄 E、Lab 18 地圖同步
- .gitignore:config/conjur/bin/、identity-broker/

Co-Authored-By: Claude Fable 5.1 <noreply@anthropic.com>
</commit_message>
<xml_diff>
--- a/Confluent-Security-Lab-Story-Guide-v2-精簡版.docx
+++ b/Confluent-Security-Lab-Story-Guide-v2-精簡版.docx
@@ -9443,7 +9443,7 @@
           <w:sz w:val="21"/>
           <w:szCs w:val="21"/>
         </w:rPr>
-        <w:t xml:space="preserve">驗證方式:本手冊的每一條「手動指令」2026-10-08 全部實跑:第 1 到 18 章整章腳本 0 失敗;手冊每一步的手動指令與專案指令由 verify-doc.mjs 實跑並判定(第 1 到 17 章 118 步 + Lab 18 共 21 步,0 不符合),手冊顯示的輸出就是該步指令實跑的結果(labguide/manual-out/)。;輸出與截圖見完整版。有介面操作的步驟以等效 API/CLI 驗證,截圖來自 Playwright 自動化。</w:t>
+        <w:t xml:space="preserve">驗證方式:本手冊的每一條「手動指令」2026-10-08 全部實跑:第 1 到 18 章整章腳本 0 失敗;手冊每一步的手動指令與專案指令由 verify-doc.mjs 實跑並判定(第 1 到 17 章 118 步 + Lab 18 共 22 步,0 不符合),手冊顯示的輸出就是該步指令實跑的結果(labguide/manual-out/)。有介面操作的步驟以等效 API/CLI 驗證,截圖來自 Playwright 自動化。</w:t>
       </w:r>
     </w:p>
     <w:p>
@@ -40538,7 +40538,7 @@
                 <w:sz w:val="21"/>
                 <w:szCs w:val="21"/>
               </w:rPr>
-              <w:t xml:space="preserve">Ming 用 CyberArk 的開源版(Conjur)在環境裡接了一遍:policy 寫清楚哪個機器身分能拿哪個秘密;應用啟動時先用自己的 API key 換 token、取密碼、在記憶體組連線設定;另一個沒被授權的應用拿不到,錯的 API key 連門都進不了。密碼輪替後,應用重新啟動就自己跟上,舊密碼立刻失效。接著他把 OP menu 的帳密、broker 設定檔的密碼也都搬進去:broker 啟動前向 Conjur 取主金鑰,設定檔裡只剩密文。</w:t>
+              <w:t xml:space="preserve">Ming 用 CyberArk 的開源版(Conjur)在環境裡接了一遍:policy 寫清楚哪個機器身分能拿哪個秘密;應用啟動時先用自己的 API key 換 token、取密碼、在記憶體組連線設定;另一個沒被授權的應用拿不到,錯的 API key 連門都進不了。密碼輪替後,應用重新啟動就自己跟上,舊密碼立刻失效。接著他把 OP menu 的帳密、broker 設定檔的密碼也都搬進去:broker 啟動前向 Conjur 取主金鑰,設定檔裡只剩密文;他也試了 CyberArk 官方的 summon 工具,正式環境的 systemd 一行就接得上。</w:t>
             </w:r>
           </w:p>
           <w:p>
@@ -41286,7 +41286,7 @@
           <w:sz w:val="21"/>
           <w:szCs w:val="21"/>
         </w:rPr>
-        <w:t xml:space="preserve">host:broker、legacy-orders、opmenu、rogue-app、svc-orders;variable:四個秘密。</w:t>
+        <w:t xml:space="preserve">host:broker、legacy-orders、opmenu、rogue-app、svc-orders;variable:四個秘密(svc-orders 的是 credential)。</w:t>
       </w:r>
     </w:p>
     <w:tbl>
@@ -43594,7 +43594,7 @@
           <w:sz w:val="21"/>
           <w:szCs w:val="21"/>
         </w:rPr>
-        <w:t xml:space="preserve">docker-compose.cyberark.yml 只覆蓋 broker2:密碼改成佔位符、啟動指令先執行 fetch-secret.py(以 host/kafka/broker 的身分取主金鑰放進環境變數)再啟動。正式環境就是 systemd 的 ExecStartPre。驗證:生效設定裡只有佔位符、環境裡沒有明文、人仍能經 broker2 登入(表示 AD 查詢密碼解對了)。</w:t>
+        <w:t xml:space="preserve">docker-compose.cyberark.yml 只覆蓋 broker2:密碼改成佔位符、啟動指令先執行 fetch-secret.py(以 host/kafka/broker 的身分取主金鑰放進環境變數)再啟動。正式環境是 systemd 的包裝腳本(注意:ExecStartPre 設的環境變數不會傳給 ExecStart)。驗證:生效設定裡只有佔位符、環境裡沒有明文、人仍能經 broker2 登入(表示 AD 查詢密碼解對了)。</w:t>
       </w:r>
     </w:p>
     <w:p>
@@ -43783,7 +43783,20 @@
         <w:rPr>
           <w:rFonts w:ascii="Microsoft JhengHei" w:cs="Microsoft JhengHei" w:eastAsia="Microsoft JhengHei" w:hAnsi="Microsoft JhengHei"/>
         </w:rPr>
-        <w:t xml:space="preserve">18.20 還原 broker2(其他 Lab 不依賴 Conjur)</w:t>
+        <w:t xml:space="preserve">18.20 設定檔密碼不落地 ③:同一件事改用 CyberArk 官方工具 summon</w:t>
+      </w:r>
+    </w:p>
+    <w:p>
+      <w:pPr>
+        <w:spacing w:after="100" w:line="300"/>
+      </w:pPr>
+      <w:r>
+        <w:rPr>
+          <w:rFonts w:ascii="Microsoft JhengHei" w:cs="Microsoft JhengHei" w:eastAsia="Microsoft JhengHei" w:hAnsi="Microsoft JhengHei"/>
+          <w:sz w:val="21"/>
+          <w:szCs w:val="21"/>
+        </w:rPr>
+        <w:t xml:space="preserve">summon + summon-conjur 是 CyberArk 的開源工具:summon 以主機身分(/etc/conjur.conf + /etc/conjur.identity)向 Conjur 取 secrets.yml 列的秘密,注入成子程序的環境變數後執行啟動程式;取不到就不執行。不用自己寫取秘密的腳本,正式環境的 systemd 只要一行:ExecStart=/usr/local/bin/summon -p summon-conjur -f /etc/kafka/secrets.yml /usr/bin/kafka-server-start /etc/kafka/server.properties。驗證:程序樹 PID 1 是 summon、java 是它的子程序;其餘與上一步相同。</w:t>
       </w:r>
     </w:p>
     <w:p>
@@ -43822,7 +43835,95 @@
           <w:sz w:val="17"/>
           <w:szCs w:val="17"/>
         </w:rPr>
-        <w:t xml:space="preserve">bash scripts/secret-protection.sh revert</w:t>
+        <w:t xml:space="preserve">bash scripts/secret-protection.sh summon-setup</w:t>
+      </w:r>
+    </w:p>
+    <w:p>
+      <w:pPr>
+        <w:pBdr>
+          <w:top w:val="none" w:color="FFFFFF" w:sz="0"/>
+          <w:left w:val="single" w:color="1F7A8C" w:sz="18" w:space="6"/>
+          <w:bottom w:val="none" w:color="FFFFFF" w:sz="0"/>
+          <w:right w:val="none" w:color="FFFFFF" w:sz="0"/>
+        </w:pBdr>
+        <w:shd w:fill="F1F4F7" w:color="auto" w:val="clear"/>
+        <w:spacing w:after="0" w:line="252"/>
+        <w:ind w:left="140" w:right="60"/>
+      </w:pPr>
+      <w:r>
+        <w:rPr>
+          <w:rFonts w:ascii="Consolas" w:cs="Consolas" w:eastAsia="Consolas" w:hAnsi="Consolas"/>
+          <w:color w:val="1B2733"/>
+          <w:sz w:val="17"/>
+          <w:szCs w:val="17"/>
+        </w:rPr>
+        <w:t xml:space="preserve">bash scripts/secret-protection.sh apply-summon</w:t>
+      </w:r>
+    </w:p>
+    <w:p>
+      <w:pPr>
+        <w:pBdr>
+          <w:top w:val="none" w:color="FFFFFF" w:sz="0"/>
+          <w:left w:val="single" w:color="1F7A8C" w:sz="18" w:space="6"/>
+          <w:bottom w:val="none" w:color="FFFFFF" w:sz="0"/>
+          <w:right w:val="none" w:color="FFFFFF" w:sz="0"/>
+        </w:pBdr>
+        <w:shd w:fill="F1F4F7" w:color="auto" w:val="clear"/>
+        <w:spacing w:after="0" w:line="252"/>
+        <w:ind w:left="140" w:right="60"/>
+      </w:pPr>
+      <w:r>
+        <w:rPr>
+          <w:rFonts w:ascii="Consolas" w:cs="Consolas" w:eastAsia="Consolas" w:hAnsi="Consolas"/>
+          <w:color w:val="1B2733"/>
+          <w:sz w:val="17"/>
+          <w:szCs w:val="17"/>
+        </w:rPr>
+        <w:t xml:space="preserve">docker exec broker2 ps -eo pid,ppid,comm | head -3</w:t>
+      </w:r>
+    </w:p>
+    <w:p>
+      <w:pPr>
+        <w:pBdr>
+          <w:top w:val="none" w:color="FFFFFF" w:sz="0"/>
+          <w:left w:val="single" w:color="1F7A8C" w:sz="18" w:space="6"/>
+          <w:bottom w:val="none" w:color="FFFFFF" w:sz="0"/>
+          <w:right w:val="none" w:color="FFFFFF" w:sz="0"/>
+        </w:pBdr>
+        <w:shd w:fill="F1F4F7" w:color="auto" w:val="clear"/>
+        <w:spacing w:after="0" w:line="252"/>
+        <w:ind w:left="140" w:right="60"/>
+      </w:pPr>
+      <w:r>
+        <w:rPr>
+          <w:rFonts w:ascii="Consolas" w:cs="Consolas" w:eastAsia="Consolas" w:hAnsi="Consolas"/>
+          <w:color w:val="1B2733"/>
+          <w:sz w:val="17"/>
+          <w:szCs w:val="17"/>
+        </w:rPr>
+        <w:t xml:space="preserve">bash scripts/secret-protection.sh show</w:t>
+      </w:r>
+    </w:p>
+    <w:p>
+      <w:pPr>
+        <w:pBdr>
+          <w:top w:val="none" w:color="FFFFFF" w:sz="0"/>
+          <w:left w:val="single" w:color="1F7A8C" w:sz="18" w:space="6"/>
+          <w:bottom w:val="none" w:color="FFFFFF" w:sz="0"/>
+          <w:right w:val="none" w:color="FFFFFF" w:sz="0"/>
+        </w:pBdr>
+        <w:shd w:fill="F1F4F7" w:color="auto" w:val="clear"/>
+        <w:spacing w:after="0" w:line="252"/>
+        <w:ind w:left="140" w:right="60"/>
+      </w:pPr>
+      <w:r>
+        <w:rPr>
+          <w:rFonts w:ascii="Consolas" w:cs="Consolas" w:eastAsia="Consolas" w:hAnsi="Consolas"/>
+          <w:color w:val="1B2733"/>
+          <w:sz w:val="17"/>
+          <w:szCs w:val="17"/>
+        </w:rPr>
+        <w:t xml:space="preserve">hc -o /dev/null -u gary:gary-pw https://broker2:8092/security/1.0/authenticate</w:t>
       </w:r>
     </w:p>
     <w:p>
@@ -43851,8 +43952,73 @@
           <w:sz w:val="21"/>
           <w:szCs w:val="21"/>
         </w:rPr>
-        <w:t xml:space="preserve">broker2 已回到原本設定。</w:t>
-      </w:r>
+        <w:t xml:space="preserve">啟動指令是 summon …;ps 裡 PID 1 = summon、java 的 PPID = 1;設定裡是 ${securepass:…};環境裡 0 處明文;[HTTP 200]。</w:t>
+      </w:r>
+    </w:p>
+    <w:tbl>
+      <w:tblPr>
+        <w:tblW w:type="dxa" w:w="9026"/>
+        <w:tblBorders>
+          <w:top w:val="single" w:color="auto" w:sz="4"/>
+          <w:left w:val="single" w:color="auto" w:sz="4"/>
+          <w:bottom w:val="single" w:color="auto" w:sz="4"/>
+          <w:right w:val="single" w:color="auto" w:sz="4"/>
+          <w:insideH w:val="single" w:color="auto" w:sz="4"/>
+          <w:insideV w:val="single" w:color="auto" w:sz="4"/>
+        </w:tblBorders>
+      </w:tblPr>
+      <w:tblGrid>
+        <w:gridCol w:w="9026"/>
+      </w:tblGrid>
+      <w:tr>
+        <w:tc>
+          <w:tcPr>
+            <w:tcW w:type="dxa" w:w="9026"/>
+            <w:tcBorders>
+              <w:top w:val="single" w:color="D5DEE6" w:sz="4"/>
+              <w:left w:val="single" w:color="B03A2E" w:sz="24"/>
+              <w:bottom w:val="single" w:color="D5DEE6" w:sz="4"/>
+              <w:right w:val="single" w:color="D5DEE6" w:sz="4"/>
+            </w:tcBorders>
+            <w:shd w:fill="FDECEA" w:color="auto" w:val="clear"/>
+            <w:tcMar>
+              <w:top w:type="dxa" w:w="80"/>
+              <w:left w:type="dxa" w:w="140"/>
+              <w:bottom w:type="dxa" w:w="80"/>
+              <w:right w:type="dxa" w:w="140"/>
+            </w:tcMar>
+          </w:tcPr>
+          <w:p>
+            <w:pPr>
+              <w:spacing w:after="0" w:line="288"/>
+            </w:pPr>
+            <w:r>
+              <w:rPr>
+                <w:rFonts w:ascii="Microsoft JhengHei" w:cs="Microsoft JhengHei" w:eastAsia="Microsoft JhengHei" w:hAnsi="Microsoft JhengHei"/>
+                <w:b/>
+                <w:bCs/>
+                <w:color w:val="B03A2E"/>
+                <w:sz w:val="20"/>
+                <w:szCs w:val="20"/>
+              </w:rPr>
+              <w:t xml:space="preserve">注意:</w:t>
+            </w:r>
+            <w:r>
+              <w:rPr>
+                <w:rFonts w:ascii="Microsoft JhengHei" w:cs="Microsoft JhengHei" w:eastAsia="Microsoft JhengHei" w:hAnsi="Microsoft JhengHei"/>
+                <w:sz w:val="20"/>
+                <w:szCs w:val="20"/>
+              </w:rPr>
+              <w:t xml:space="preserve">第一次執行 summon-setup 會從 GitHub(cyberark 官方 release)下載 summon 與 summon-conjur 共約 10 MB,並比對官方 SHA256SUMS;放在 config/conjur/bin/,不進版本庫。</w:t>
+            </w:r>
+          </w:p>
+        </w:tc>
+      </w:tr>
+    </w:tbl>
+    <w:p>
+      <w:pPr>
+        <w:spacing w:after="80"/>
+      </w:pPr>
     </w:p>
     <w:p>
       <w:pPr>
@@ -43863,7 +44029,87 @@
         <w:rPr>
           <w:rFonts w:ascii="Microsoft JhengHei" w:cs="Microsoft JhengHei" w:eastAsia="Microsoft JhengHei" w:hAnsi="Microsoft JhengHei"/>
         </w:rPr>
-        <w:t xml:space="preserve">18.21 稽核:Conjur 記錄誰取了什麼</w:t>
+        <w:t xml:space="preserve">18.21 還原 broker2(其他 Lab 不依賴 Conjur)</w:t>
+      </w:r>
+    </w:p>
+    <w:p>
+      <w:pPr>
+        <w:keepNext/>
+        <w:spacing w:after="60" w:before="120"/>
+      </w:pPr>
+      <w:r>
+        <w:rPr>
+          <w:rFonts w:ascii="Microsoft JhengHei" w:cs="Microsoft JhengHei" w:eastAsia="Microsoft JhengHei" w:hAnsi="Microsoft JhengHei"/>
+          <w:b/>
+          <w:bCs/>
+          <w:color w:val="1F7A8C"/>
+          <w:sz w:val="20"/>
+          <w:szCs w:val="20"/>
+        </w:rPr>
+        <w:t xml:space="preserve">手動指令</w:t>
+      </w:r>
+    </w:p>
+    <w:p>
+      <w:pPr>
+        <w:pBdr>
+          <w:top w:val="none" w:color="FFFFFF" w:sz="0"/>
+          <w:left w:val="single" w:color="1F7A8C" w:sz="18" w:space="6"/>
+          <w:bottom w:val="none" w:color="FFFFFF" w:sz="0"/>
+          <w:right w:val="none" w:color="FFFFFF" w:sz="0"/>
+        </w:pBdr>
+        <w:shd w:fill="F1F4F7" w:color="auto" w:val="clear"/>
+        <w:spacing w:after="0" w:line="252"/>
+        <w:ind w:left="140" w:right="60"/>
+      </w:pPr>
+      <w:r>
+        <w:rPr>
+          <w:rFonts w:ascii="Consolas" w:cs="Consolas" w:eastAsia="Consolas" w:hAnsi="Consolas"/>
+          <w:color w:val="1B2733"/>
+          <w:sz w:val="17"/>
+          <w:szCs w:val="17"/>
+        </w:rPr>
+        <w:t xml:space="preserve">bash scripts/secret-protection.sh revert</w:t>
+      </w:r>
+    </w:p>
+    <w:p>
+      <w:pPr>
+        <w:spacing w:after="80"/>
+      </w:pPr>
+    </w:p>
+    <w:p>
+      <w:pPr>
+        <w:spacing w:after="100" w:line="300"/>
+      </w:pPr>
+      <w:r>
+        <w:rPr>
+          <w:rFonts w:ascii="Microsoft JhengHei" w:cs="Microsoft JhengHei" w:eastAsia="Microsoft JhengHei" w:hAnsi="Microsoft JhengHei"/>
+          <w:b/>
+          <w:bCs/>
+          <w:color w:val="B7791F"/>
+          <w:sz w:val="21"/>
+          <w:szCs w:val="21"/>
+        </w:rPr>
+        <w:t xml:space="preserve">預期:</w:t>
+      </w:r>
+      <w:r>
+        <w:rPr>
+          <w:rFonts w:ascii="Microsoft JhengHei" w:cs="Microsoft JhengHei" w:eastAsia="Microsoft JhengHei" w:hAnsi="Microsoft JhengHei"/>
+          <w:sz w:val="21"/>
+          <w:szCs w:val="21"/>
+        </w:rPr>
+        <w:t xml:space="preserve">broker2 已回到原本設定。</w:t>
+      </w:r>
+    </w:p>
+    <w:p>
+      <w:pPr>
+        <w:pStyle w:val="Heading3"/>
+        <w:keepNext/>
+      </w:pPr>
+      <w:r>
+        <w:rPr>
+          <w:rFonts w:ascii="Microsoft JhengHei" w:cs="Microsoft JhengHei" w:eastAsia="Microsoft JhengHei" w:hAnsi="Microsoft JhengHei"/>
+        </w:rPr>
+        <w:t xml:space="preserve">18.22 稽核:Conjur 記錄誰取了什麼</w:t>
       </w:r>
     </w:p>
     <w:p>
@@ -47030,6 +47276,80 @@
                 <w:szCs w:val="17"/>
               </w:rPr>
               <w:t xml:space="preserve">刻意的;所以 Conjur 的可用性要和 broker 同級</w:t>
+            </w:r>
+          </w:p>
+        </w:tc>
+      </w:tr>
+      <w:tr>
+        <w:trPr>
+          <w:cantSplit/>
+          <w:tblHeader w:val="off"/>
+        </w:trPr>
+        <w:tc>
+          <w:tcPr>
+            <w:tcW w:type="dxa" w:w="4600"/>
+            <w:tcBorders>
+              <w:top w:val="single" w:color="C9D3DC" w:sz="4"/>
+              <w:left w:val="single" w:color="C9D3DC" w:sz="4"/>
+              <w:bottom w:val="single" w:color="C9D3DC" w:sz="4"/>
+              <w:right w:val="single" w:color="C9D3DC" w:sz="4"/>
+            </w:tcBorders>
+            <w:shd w:fill="FFFFFF" w:color="auto" w:val="clear"/>
+            <w:tcMar>
+              <w:top w:type="dxa" w:w="60"/>
+              <w:left w:type="dxa" w:w="100"/>
+              <w:bottom w:type="dxa" w:w="60"/>
+              <w:right w:type="dxa" w:w="100"/>
+            </w:tcMar>
+          </w:tcPr>
+          <w:p>
+            <w:pPr>
+              <w:spacing w:after="0" w:line="276"/>
+            </w:pPr>
+            <w:r>
+              <w:rPr>
+                <w:rFonts w:ascii="Microsoft JhengHei" w:cs="Microsoft JhengHei" w:eastAsia="Microsoft JhengHei" w:hAnsi="Microsoft JhengHei"/>
+                <w:b w:val="false"/>
+                <w:bCs w:val="false"/>
+                <w:color w:val="22313F"/>
+                <w:sz w:val="17"/>
+                <w:szCs w:val="17"/>
+              </w:rPr>
+              <w:t xml:space="preserve">CyberArk 官方 summon + summon-conjur 對開源版 Conjur 可用:主金鑰只在 java 程序的環境(容器環境、/tmp 都沒有),錯 API key 回 401、啟動程式不執行</w:t>
+            </w:r>
+          </w:p>
+        </w:tc>
+        <w:tc>
+          <w:tcPr>
+            <w:tcW w:type="dxa" w:w="4426"/>
+            <w:tcBorders>
+              <w:top w:val="single" w:color="C9D3DC" w:sz="4"/>
+              <w:left w:val="single" w:color="C9D3DC" w:sz="4"/>
+              <w:bottom w:val="single" w:color="C9D3DC" w:sz="4"/>
+              <w:right w:val="single" w:color="C9D3DC" w:sz="4"/>
+            </w:tcBorders>
+            <w:shd w:fill="FFFFFF" w:color="auto" w:val="clear"/>
+            <w:tcMar>
+              <w:top w:type="dxa" w:w="60"/>
+              <w:left w:type="dxa" w:w="100"/>
+              <w:bottom w:type="dxa" w:w="60"/>
+              <w:right w:type="dxa" w:w="100"/>
+            </w:tcMar>
+          </w:tcPr>
+          <w:p>
+            <w:pPr>
+              <w:spacing w:after="0" w:line="276"/>
+            </w:pPr>
+            <w:r>
+              <w:rPr>
+                <w:rFonts w:ascii="Microsoft JhengHei" w:cs="Microsoft JhengHei" w:eastAsia="Microsoft JhengHei" w:hAnsi="Microsoft JhengHei"/>
+                <w:b w:val="false"/>
+                <w:bCs w:val="false"/>
+                <w:color w:val="22313F"/>
+                <w:sz w:val="17"/>
+                <w:szCs w:val="17"/>
+              </w:rPr>
+              <w:t xml:space="preserve">正式環境 systemd 只要 ExecStart=summon -p summon-conjur -f secrets.yml kafka-server-start … 一行;不要用 ExecStartPre 取秘密(它設的環境變數不會傳給 ExecStart)</w:t>
             </w:r>
           </w:p>
         </w:tc>

</xml_diff>

<commit_message>
第 20 章:Schema Registry 與欄位級加密(CSFLE)的授權;Lab 20、手冊 v2 重產;broker 重啟自癒(OP menu docker 後端)
- Schema Registry(profile sr)納入 MDS / AD 群組授權:認證 401、subject 授權、KEK(Kek:<名稱>)授權;scripts/sr-setup.sh、scenarios/ch20-schema-registry.sh(5/5)
- SR 設定要點:inter.instance.protocol=https、CUB_CLASSPATH、Security + DekRegistry + RuleSet 三個 resource extension、dek.registry.rbac.enable、SR 身分需 SR 叢集範圍 SecurityAdmin 與 _dek_registry 前綴 topic 的 ResourceOwner
- CSFLE 加密與解密未驗證:註冊 ENCRYPT 規則回 402(需企業版 + CSFLE 加購授權);SR 沒開 RuleSet extension 時規則被默默丟掉、卡號以明文寫入(測試觀察)
- 從零重建後第 1 到 20 章整章腳本 0 失敗;第 15、16 章 0 失敗;verify-doc 第 18、19、20 章 35 步 0 不符合
- OP menu docker 後端重啟 broker 後接 broker-heal.sh(demo 專用;根因未查明,見 RUNBOOK 第 19 章)

Co-Authored-By: Claude Sonnet 5.5 <noreply@anthropic.com>
</commit_message>
<xml_diff>
--- a/Confluent-Security-Lab-Story-Guide-v2-精簡版.docx
+++ b/Confluent-Security-Lab-Story-Guide-v2-精簡版.docx
@@ -551,7 +551,7 @@
                 <w:sz w:val="19"/>
                 <w:szCs w:val="19"/>
               </w:rPr>
-              <w:t xml:space="preserve">本版以故事串起來,並新增 Lab 15(人員異動)、Lab 16(OP menu)、Lab 17(傳輸加密補強)、Lab 18(CyberArk 整合)與 Lab 19(帳號被偷之後);舊版 Confluent-Security-Lab-Guide.docx 保留</w:t>
+              <w:t xml:space="preserve">本版以故事串起來,並新增 Lab 15(人員異動)、Lab 16(OP menu)、Lab 17(傳輸加密補強)、Lab 18(CyberArk 整合)、Lab 19(帳號被偷之後)與 Lab 20(Schema Registry 與欄位級加密);舊版 Confluent-Security-Lab-Guide.docx 保留</w:t>
             </w:r>
           </w:p>
         </w:tc>
@@ -2790,6 +2790,114 @@
                 <w:szCs w:val="17"/>
               </w:rPr>
               <w:t xml:space="preserve">Lab 18(CyberArk 整合;第一次跑 Lab 18 時才下載)</w:t>
+            </w:r>
+          </w:p>
+        </w:tc>
+      </w:tr>
+      <w:tr>
+        <w:trPr>
+          <w:cantSplit/>
+          <w:tblHeader w:val="off"/>
+        </w:trPr>
+        <w:tc>
+          <w:tcPr>
+            <w:tcW w:type="dxa" w:w="4200"/>
+            <w:tcBorders>
+              <w:top w:val="single" w:color="C9D3DC" w:sz="4"/>
+              <w:left w:val="single" w:color="C9D3DC" w:sz="4"/>
+              <w:bottom w:val="single" w:color="C9D3DC" w:sz="4"/>
+              <w:right w:val="single" w:color="C9D3DC" w:sz="4"/>
+            </w:tcBorders>
+            <w:shd w:fill="FFFFFF" w:color="auto" w:val="clear"/>
+            <w:tcMar>
+              <w:top w:type="dxa" w:w="60"/>
+              <w:left w:type="dxa" w:w="100"/>
+              <w:bottom w:type="dxa" w:w="60"/>
+              <w:right w:type="dxa" w:w="100"/>
+            </w:tcMar>
+          </w:tcPr>
+          <w:p>
+            <w:pPr>
+              <w:spacing w:after="0" w:line="276"/>
+            </w:pPr>
+            <w:r>
+              <w:rPr>
+                <w:rFonts w:ascii="Microsoft JhengHei" w:cs="Microsoft JhengHei" w:eastAsia="Microsoft JhengHei" w:hAnsi="Microsoft JhengHei"/>
+                <w:b w:val="false"/>
+                <w:bCs w:val="false"/>
+                <w:color w:val="22313F"/>
+                <w:sz w:val="17"/>
+                <w:szCs w:val="17"/>
+              </w:rPr>
+              <w:t xml:space="preserve">confluentinc/cp-schema-registry:8.3.2</w:t>
+            </w:r>
+          </w:p>
+        </w:tc>
+        <w:tc>
+          <w:tcPr>
+            <w:tcW w:type="dxa" w:w="1500"/>
+            <w:tcBorders>
+              <w:top w:val="single" w:color="C9D3DC" w:sz="4"/>
+              <w:left w:val="single" w:color="C9D3DC" w:sz="4"/>
+              <w:bottom w:val="single" w:color="C9D3DC" w:sz="4"/>
+              <w:right w:val="single" w:color="C9D3DC" w:sz="4"/>
+            </w:tcBorders>
+            <w:shd w:fill="FFFFFF" w:color="auto" w:val="clear"/>
+            <w:tcMar>
+              <w:top w:type="dxa" w:w="60"/>
+              <w:left w:type="dxa" w:w="100"/>
+              <w:bottom w:type="dxa" w:w="60"/>
+              <w:right w:type="dxa" w:w="100"/>
+            </w:tcMar>
+          </w:tcPr>
+          <w:p>
+            <w:pPr>
+              <w:spacing w:after="0" w:line="276"/>
+            </w:pPr>
+            <w:r>
+              <w:rPr>
+                <w:rFonts w:ascii="Microsoft JhengHei" w:cs="Microsoft JhengHei" w:eastAsia="Microsoft JhengHei" w:hAnsi="Microsoft JhengHei"/>
+                <w:b w:val="false"/>
+                <w:bCs w:val="false"/>
+                <w:color w:val="22313F"/>
+                <w:sz w:val="17"/>
+                <w:szCs w:val="17"/>
+              </w:rPr>
+              <w:t xml:space="preserve">1.5 GB</w:t>
+            </w:r>
+          </w:p>
+        </w:tc>
+        <w:tc>
+          <w:tcPr>
+            <w:tcW w:type="dxa" w:w="3326"/>
+            <w:tcBorders>
+              <w:top w:val="single" w:color="C9D3DC" w:sz="4"/>
+              <w:left w:val="single" w:color="C9D3DC" w:sz="4"/>
+              <w:bottom w:val="single" w:color="C9D3DC" w:sz="4"/>
+              <w:right w:val="single" w:color="C9D3DC" w:sz="4"/>
+            </w:tcBorders>
+            <w:shd w:fill="FFFFFF" w:color="auto" w:val="clear"/>
+            <w:tcMar>
+              <w:top w:type="dxa" w:w="60"/>
+              <w:left w:type="dxa" w:w="100"/>
+              <w:bottom w:type="dxa" w:w="60"/>
+              <w:right w:type="dxa" w:w="100"/>
+            </w:tcMar>
+          </w:tcPr>
+          <w:p>
+            <w:pPr>
+              <w:spacing w:after="0" w:line="276"/>
+            </w:pPr>
+            <w:r>
+              <w:rPr>
+                <w:rFonts w:ascii="Microsoft JhengHei" w:cs="Microsoft JhengHei" w:eastAsia="Microsoft JhengHei" w:hAnsi="Microsoft JhengHei"/>
+                <w:b w:val="false"/>
+                <w:bCs w:val="false"/>
+                <w:color w:val="22313F"/>
+                <w:sz w:val="17"/>
+                <w:szCs w:val="17"/>
+              </w:rPr>
+              <w:t xml:space="preserve">Lab 20(Schema Registry;第一次跑 Lab 20 時才下載)</w:t>
             </w:r>
           </w:p>
         </w:tc>
@@ -6756,7 +6864,7 @@
                 <w:sz w:val="18"/>
                 <w:szCs w:val="18"/>
               </w:rPr>
-              <w:t xml:space="preserve">異動、日常維運、傳輸加密、CyberArk 與帳號被偷</w:t>
+              <w:t xml:space="preserve">異動、日常維運、傳輸加密、CyberArk、帳號被偷與 Schema Registry</w:t>
             </w:r>
           </w:p>
         </w:tc>
@@ -6790,7 +6898,7 @@
                 <w:sz w:val="18"/>
                 <w:szCs w:val="18"/>
               </w:rPr>
-              <w:t xml:space="preserve">Lab 15、Lab 16、Lab 17、Lab 18、Lab 19</w:t>
+              <w:t xml:space="preserve">Lab 15、Lab 16、Lab 17、Lab 18、Lab 19、Lab 20</w:t>
             </w:r>
           </w:p>
         </w:tc>
@@ -9443,7 +9551,7 @@
           <w:sz w:val="21"/>
           <w:szCs w:val="21"/>
         </w:rPr>
-        <w:t xml:space="preserve">驗證方式:本手冊的每一條「手動指令」2026-10-09 驗證:第 1 到 19 章的整章腳本在含新設定(SASL 重新認證 60 秒、TLS 套件限定、認證失敗指標)的環境重跑,0 失敗;第 18、19 章共 30 步的手動指令這次重新實跑並判定,0 不符合,手冊顯示的輸出就是該步指令實跑的結果(labguide/manual-out/);第 1 到 17 章的 118 步手動指令為上一輪(2026-10-08)實跑 0 不符合的結果,本次未逐步重跑。有介面操作的步驟以等效 API/CLI 驗證,截圖來自 Playwright 自動化。</w:t>
+        <w:t xml:space="preserve">驗證方式:本手冊的每一條「手動指令」2026-10-09 驗證:從零重建後,第 1 到 20 章的整章腳本 0 失敗(第 15、16 章另跑,0 失敗;第 16 章在原本那次跑時 broker 重啟失敗一次,屬已知未解問題,見 RUNBOOK 第 19 章);第 18、19、20 章共 35 步的手動指令這次重新實跑並判定,0 不符合,手冊顯示的輸出就是該步指令實跑的結果(labguide/manual-out/);第 1 到 17 章的 118 步手動指令為上一輪(2026-10-08)實跑 0 不符合的結果,本次未逐步重跑。第 20 章的欄位級加密(CSFLE)需要企業版加購授權,加密與解密在這個環境未驗證。有介面操作的步驟以等效 API/CLI 驗證,截圖來自 Playwright 自動化。</w:t>
       </w:r>
     </w:p>
     <w:p>
@@ -34368,7 +34476,7 @@
         <w:rPr>
           <w:rFonts w:ascii="Microsoft JhengHei" w:cs="Microsoft JhengHei" w:eastAsia="Microsoft JhengHei" w:hAnsi="Microsoft JhengHei"/>
         </w:rPr>
-        <w:t xml:space="preserve">第三週:異動、日常維運、傳輸加密、CyberArk 與帳號被偷</w:t>
+        <w:t xml:space="preserve">第三週:異動、日常維運、傳輸加密、CyberArk、帳號被偷與 Schema Registry</w:t>
       </w:r>
     </w:p>
     <w:tbl>
@@ -46675,6 +46783,1833 @@
     </w:p>
     <w:p>
       <w:pPr>
+        <w:pStyle w:val="Heading2"/>
+        <w:pageBreakBefore/>
+      </w:pPr>
+      <w:r>
+        <w:rPr>
+          <w:rFonts w:ascii="Microsoft JhengHei" w:cs="Microsoft JhengHei" w:eastAsia="Microsoft JhengHei" w:hAnsi="Microsoft JhengHei"/>
+        </w:rPr>
+        <w:t xml:space="preserve">Lab 20  (進階)Schema Registry 與欄位級加密(CSFLE):同一套授權,與授權限制</w:t>
+      </w:r>
+    </w:p>
+    <w:p>
+      <w:pPr>
+        <w:keepNext/>
+        <w:pBdr>
+          <w:top w:val="single" w:color="C9D3DC" w:sz="4" w:space="4"/>
+          <w:left w:val="single" w:color="C9D3DC" w:sz="4" w:space="4"/>
+          <w:bottom w:val="single" w:color="C9D3DC" w:sz="4" w:space="4"/>
+          <w:right w:val="single" w:color="C9D3DC" w:sz="4" w:space="4"/>
+        </w:pBdr>
+        <w:spacing w:after="40" w:before="80"/>
+        <w:jc w:val="center"/>
+      </w:pPr>
+      <w:r>
+        <w:drawing>
+          <wp:inline distT="0" distB="0" distL="0" distR="0">
+            <wp:extent cx="5619750" cy="1866900"/>
+            <wp:effectExtent t="0" r="0" b="0" l="0"/>
+            <wp:docPr id="21" name="labmap-20.png" descr="Lab 20 地圖:這堂要證明的事、動到的元件(打亮)、走的路與結果(✔ 允許 / ✘ 拒絕)" title="Lab 20 地圖:這堂要證明的事、動到的元件(打亮)、走的路與結果(✔ 允許 / ✘ 拒絕)"/>
+            <wp:cNvGraphicFramePr>
+              <a:graphicFrameLocks xmlns:a="http://schemas.openxmlformats.org/drawingml/2006/main" noChangeAspect="1"/>
+            </wp:cNvGraphicFramePr>
+            <a:graphic xmlns:a="http://schemas.openxmlformats.org/drawingml/2006/main">
+              <a:graphicData uri="http://schemas.openxmlformats.org/drawingml/2006/picture">
+                <pic:pic xmlns:pic="http://schemas.openxmlformats.org/drawingml/2006/picture">
+                  <pic:nvPicPr>
+                    <pic:cNvPr id="0" name="" descr=""/>
+                    <pic:cNvPicPr>
+                      <a:picLocks noChangeAspect="1" noChangeArrowheads="1"/>
+                    </pic:cNvPicPr>
+                  </pic:nvPicPr>
+                  <pic:blipFill>
+                    <a:blip r:embed="rId29" cstate="none"/>
+                    <a:srcRect/>
+                    <a:stretch>
+                      <a:fillRect/>
+                    </a:stretch>
+                  </pic:blipFill>
+                  <pic:spPr bwMode="auto">
+                    <a:xfrm>
+                      <a:off x="0" y="0"/>
+                      <a:ext cx="5619750" cy="1866900"/>
+                    </a:xfrm>
+                    <a:prstGeom prst="rect">
+                      <a:avLst/>
+                    </a:prstGeom>
+                  </pic:spPr>
+                </pic:pic>
+              </a:graphicData>
+            </a:graphic>
+          </wp:inline>
+        </w:drawing>
+      </w:r>
+    </w:p>
+    <w:p>
+      <w:pPr>
+        <w:spacing w:after="140"/>
+        <w:jc w:val="center"/>
+      </w:pPr>
+      <w:r>
+        <w:rPr>
+          <w:rFonts w:ascii="Microsoft JhengHei" w:cs="Microsoft JhengHei" w:eastAsia="Microsoft JhengHei" w:hAnsi="Microsoft JhengHei"/>
+          <w:i/>
+          <w:iCs/>
+          <w:color w:val="5B6B7A"/>
+          <w:sz w:val="18"/>
+          <w:szCs w:val="18"/>
+        </w:rPr>
+        <w:t xml:space="preserve">▲ Lab 20 地圖:這堂要證明的事、動到的元件(打亮)、走的路與結果(✔ 允許 / ✘ 拒絕)</w:t>
+      </w:r>
+    </w:p>
+    <w:tbl>
+      <w:tblPr>
+        <w:tblW w:type="dxa" w:w="9026"/>
+        <w:tblBorders>
+          <w:top w:val="single" w:color="auto" w:sz="4"/>
+          <w:left w:val="single" w:color="auto" w:sz="4"/>
+          <w:bottom w:val="single" w:color="auto" w:sz="4"/>
+          <w:right w:val="single" w:color="auto" w:sz="4"/>
+          <w:insideH w:val="single" w:color="auto" w:sz="4"/>
+          <w:insideV w:val="single" w:color="auto" w:sz="4"/>
+        </w:tblBorders>
+      </w:tblPr>
+      <w:tblGrid>
+        <w:gridCol w:w="9026"/>
+      </w:tblGrid>
+      <w:tr>
+        <w:tc>
+          <w:tcPr>
+            <w:tcW w:type="dxa" w:w="9026"/>
+            <w:tcBorders>
+              <w:top w:val="single" w:color="DDD3EC" w:sz="4"/>
+              <w:left w:val="single" w:color="6B4FA0" w:sz="30"/>
+              <w:bottom w:val="single" w:color="DDD3EC" w:sz="4"/>
+              <w:right w:val="single" w:color="DDD3EC" w:sz="4"/>
+            </w:tcBorders>
+            <w:shd w:fill="F4F0FA" w:color="auto" w:val="clear"/>
+            <w:tcMar>
+              <w:top w:type="dxa" w:w="100"/>
+              <w:left w:type="dxa" w:w="180"/>
+              <w:bottom w:type="dxa" w:w="100"/>
+              <w:right w:type="dxa" w:w="180"/>
+            </w:tcMar>
+          </w:tcPr>
+          <w:p>
+            <w:pPr>
+              <w:spacing w:after="60"/>
+            </w:pPr>
+            <w:r>
+              <w:rPr>
+                <w:rFonts w:ascii="Microsoft JhengHei" w:cs="Microsoft JhengHei" w:eastAsia="Microsoft JhengHei" w:hAnsi="Microsoft JhengHei"/>
+                <w:b/>
+                <w:bCs/>
+                <w:color w:val="6B4FA0"/>
+                <w:sz w:val="19"/>
+                <w:szCs w:val="19"/>
+              </w:rPr>
+              <w:t xml:space="preserve">情境</w:t>
+            </w:r>
+          </w:p>
+          <w:p>
+            <w:pPr>
+              <w:spacing w:after="70" w:line="312"/>
+            </w:pPr>
+            <w:r>
+              <w:rPr>
+                <w:rFonts w:ascii="Microsoft JhengHei" w:cs="Microsoft JhengHei" w:eastAsia="Microsoft JhengHei" w:hAnsi="Microsoft JhengHei"/>
+                <w:color w:val="2B2540"/>
+                <w:sz w:val="21"/>
+                <w:szCs w:val="21"/>
+              </w:rPr>
+              <w:t xml:space="preserve">開發團隊問:「我們的 schema 放哪?卡號欄位能不能加密?」Gary 看了 Schema Registry,第一個問題是:它也要納入同一套授權,不能變成另一個沒人管的入口。</w:t>
+            </w:r>
+          </w:p>
+          <w:p>
+            <w:pPr>
+              <w:spacing w:after="70" w:line="312"/>
+            </w:pPr>
+            <w:r>
+              <w:rPr>
+                <w:rFonts w:ascii="Microsoft JhengHei" w:cs="Microsoft JhengHei" w:eastAsia="Microsoft JhengHei" w:hAnsi="Microsoft JhengHei"/>
+                <w:color w:val="2B2540"/>
+                <w:sz w:val="21"/>
+                <w:szCs w:val="21"/>
+              </w:rPr>
+              <w:t xml:space="preserve">Ming 把 Schema Registry 接上 MDS:不帶帳密 401;yujie 能註冊 orders. 的 schema,註冊 payments. 的被拒;加密金鑰(KEK)只有 security 群組能建,yujie 只能讀,ming 什麼 role 都沒有就連讀都不行。</w:t>
+            </w:r>
+          </w:p>
+          <w:p>
+            <w:pPr>
+              <w:spacing w:after="70" w:line="312"/>
+            </w:pPr>
+            <w:r>
+              <w:rPr>
+                <w:rFonts w:ascii="Microsoft JhengHei" w:cs="Microsoft JhengHei" w:eastAsia="Microsoft JhengHei" w:hAnsi="Microsoft JhengHei"/>
+                <w:color w:val="2B2540"/>
+                <w:sz w:val="21"/>
+                <w:szCs w:val="21"/>
+              </w:rPr>
+              <w:t xml:space="preserve">輪到欄位加密時,他碰到牆:註冊帶加密規則的 schema 回 402,要企業版再加購 CSFLE 授權。他沒有假裝做完——把「沒驗證」和原因寫進報告,也記下一個危險的失敗模式:Schema Registry 若沒開規則 extension,規則會被默默丟掉,producer 不報錯,卡號卻以明文寫進 topic。</w:t>
+            </w:r>
+          </w:p>
+        </w:tc>
+      </w:tr>
+    </w:tbl>
+    <w:p>
+      <w:pPr>
+        <w:spacing w:after="100"/>
+      </w:pPr>
+    </w:p>
+    <w:p>
+      <w:pPr>
+        <w:keepNext/>
+        <w:spacing w:after="60" w:before="120"/>
+      </w:pPr>
+      <w:r>
+        <w:rPr>
+          <w:rFonts w:ascii="Microsoft JhengHei" w:cs="Microsoft JhengHei" w:eastAsia="Microsoft JhengHei" w:hAnsi="Microsoft JhengHei"/>
+          <w:b/>
+          <w:bCs/>
+          <w:color w:val="6B4FA0"/>
+          <w:sz w:val="20"/>
+          <w:szCs w:val="20"/>
+        </w:rPr>
+        <w:t xml:space="preserve">Ming 的任務(做完請自己對照)</w:t>
+      </w:r>
+    </w:p>
+    <w:p>
+      <w:pPr>
+        <w:spacing w:after="100" w:line="300"/>
+        <w:ind w:left="360"/>
+      </w:pPr>
+      <w:r>
+        <w:rPr>
+          <w:rFonts w:ascii="Microsoft JhengHei" w:cs="Microsoft JhengHei" w:eastAsia="Microsoft JhengHei" w:hAnsi="Microsoft JhengHei"/>
+          <w:b/>
+          <w:bCs/>
+          <w:color w:val="6B4FA0"/>
+          <w:sz w:val="21"/>
+          <w:szCs w:val="21"/>
+        </w:rPr>
+        <w:t xml:space="preserve">☐  </w:t>
+      </w:r>
+      <w:r>
+        <w:rPr>
+          <w:rFonts w:ascii="Microsoft JhengHei" w:cs="Microsoft JhengHei" w:eastAsia="Microsoft JhengHei" w:hAnsi="Microsoft JhengHei"/>
+          <w:sz w:val="21"/>
+          <w:szCs w:val="21"/>
+        </w:rPr>
+        <w:t xml:space="preserve">讓 Schema Registry 用同一套 AD 群組授權。</w:t>
+      </w:r>
+    </w:p>
+    <w:p>
+      <w:pPr>
+        <w:spacing w:after="100" w:line="300"/>
+        <w:ind w:left="360"/>
+      </w:pPr>
+      <w:r>
+        <w:rPr>
+          <w:rFonts w:ascii="Microsoft JhengHei" w:cs="Microsoft JhengHei" w:eastAsia="Microsoft JhengHei" w:hAnsi="Microsoft JhengHei"/>
+          <w:b/>
+          <w:bCs/>
+          <w:color w:val="6B4FA0"/>
+          <w:sz w:val="21"/>
+          <w:szCs w:val="21"/>
+        </w:rPr>
+        <w:t xml:space="preserve">☐  </w:t>
+      </w:r>
+      <w:r>
+        <w:rPr>
+          <w:rFonts w:ascii="Microsoft JhengHei" w:cs="Microsoft JhengHei" w:eastAsia="Microsoft JhengHei" w:hAnsi="Microsoft JhengHei"/>
+          <w:sz w:val="21"/>
+          <w:szCs w:val="21"/>
+        </w:rPr>
+        <w:t xml:space="preserve">確認 KEK 的建立與讀取權限分開。</w:t>
+      </w:r>
+    </w:p>
+    <w:p>
+      <w:pPr>
+        <w:spacing w:after="100" w:line="300"/>
+        <w:ind w:left="360"/>
+      </w:pPr>
+      <w:r>
+        <w:rPr>
+          <w:rFonts w:ascii="Microsoft JhengHei" w:cs="Microsoft JhengHei" w:eastAsia="Microsoft JhengHei" w:hAnsi="Microsoft JhengHei"/>
+          <w:b/>
+          <w:bCs/>
+          <w:color w:val="6B4FA0"/>
+          <w:sz w:val="21"/>
+          <w:szCs w:val="21"/>
+        </w:rPr>
+        <w:t xml:space="preserve">☐  </w:t>
+      </w:r>
+      <w:r>
+        <w:rPr>
+          <w:rFonts w:ascii="Microsoft JhengHei" w:cs="Microsoft JhengHei" w:eastAsia="Microsoft JhengHei" w:hAnsi="Microsoft JhengHei"/>
+          <w:sz w:val="21"/>
+          <w:szCs w:val="21"/>
+        </w:rPr>
+        <w:t xml:space="preserve">確認欄位級加密在這個環境能不能驗證,並如實記下原因。</w:t>
+      </w:r>
+    </w:p>
+    <w:tbl>
+      <w:tblPr>
+        <w:tblW w:type="dxa" w:w="9026"/>
+        <w:tblBorders>
+          <w:top w:val="single" w:color="auto" w:sz="4"/>
+          <w:left w:val="single" w:color="auto" w:sz="4"/>
+          <w:bottom w:val="single" w:color="auto" w:sz="4"/>
+          <w:right w:val="single" w:color="auto" w:sz="4"/>
+          <w:insideH w:val="single" w:color="auto" w:sz="4"/>
+          <w:insideV w:val="single" w:color="auto" w:sz="4"/>
+        </w:tblBorders>
+      </w:tblPr>
+      <w:tblGrid>
+        <w:gridCol w:w="1700"/>
+        <w:gridCol w:w="7326"/>
+      </w:tblGrid>
+      <w:tr>
+        <w:trPr>
+          <w:cantSplit/>
+          <w:tblHeader/>
+        </w:trPr>
+        <w:tc>
+          <w:tcPr>
+            <w:tcW w:type="dxa" w:w="1700"/>
+            <w:tcBorders>
+              <w:top w:val="single" w:color="C9D3DC" w:sz="4"/>
+              <w:left w:val="single" w:color="C9D3DC" w:sz="4"/>
+              <w:bottom w:val="single" w:color="C9D3DC" w:sz="4"/>
+              <w:right w:val="single" w:color="C9D3DC" w:sz="4"/>
+            </w:tcBorders>
+            <w:shd w:fill="12263A" w:color="auto" w:val="clear"/>
+            <w:tcMar>
+              <w:top w:type="dxa" w:w="60"/>
+              <w:left w:type="dxa" w:w="100"/>
+              <w:bottom w:type="dxa" w:w="60"/>
+              <w:right w:type="dxa" w:w="100"/>
+            </w:tcMar>
+          </w:tcPr>
+          <w:p>
+            <w:pPr>
+              <w:spacing w:after="0" w:line="276"/>
+            </w:pPr>
+            <w:r>
+              <w:rPr>
+                <w:rFonts w:ascii="Microsoft JhengHei" w:cs="Microsoft JhengHei" w:eastAsia="Microsoft JhengHei" w:hAnsi="Microsoft JhengHei"/>
+                <w:b/>
+                <w:bCs/>
+                <w:color w:val="FFFFFF"/>
+                <w:sz w:val="19"/>
+                <w:szCs w:val="19"/>
+              </w:rPr>
+              <w:t xml:space="preserve">項目</w:t>
+            </w:r>
+          </w:p>
+        </w:tc>
+        <w:tc>
+          <w:tcPr>
+            <w:tcW w:type="dxa" w:w="7326"/>
+            <w:tcBorders>
+              <w:top w:val="single" w:color="C9D3DC" w:sz="4"/>
+              <w:left w:val="single" w:color="C9D3DC" w:sz="4"/>
+              <w:bottom w:val="single" w:color="C9D3DC" w:sz="4"/>
+              <w:right w:val="single" w:color="C9D3DC" w:sz="4"/>
+            </w:tcBorders>
+            <w:shd w:fill="12263A" w:color="auto" w:val="clear"/>
+            <w:tcMar>
+              <w:top w:type="dxa" w:w="60"/>
+              <w:left w:type="dxa" w:w="100"/>
+              <w:bottom w:type="dxa" w:w="60"/>
+              <w:right w:type="dxa" w:w="100"/>
+            </w:tcMar>
+          </w:tcPr>
+          <w:p>
+            <w:pPr>
+              <w:spacing w:after="0" w:line="276"/>
+            </w:pPr>
+            <w:r>
+              <w:rPr>
+                <w:rFonts w:ascii="Microsoft JhengHei" w:cs="Microsoft JhengHei" w:eastAsia="Microsoft JhengHei" w:hAnsi="Microsoft JhengHei"/>
+                <w:b/>
+                <w:bCs/>
+                <w:color w:val="FFFFFF"/>
+                <w:sz w:val="19"/>
+                <w:szCs w:val="19"/>
+              </w:rPr>
+              <w:t xml:space="preserve">內容</w:t>
+            </w:r>
+          </w:p>
+        </w:tc>
+      </w:tr>
+      <w:tr>
+        <w:trPr>
+          <w:cantSplit/>
+          <w:tblHeader w:val="off"/>
+        </w:trPr>
+        <w:tc>
+          <w:tcPr>
+            <w:tcW w:type="dxa" w:w="1700"/>
+            <w:tcBorders>
+              <w:top w:val="single" w:color="C9D3DC" w:sz="4"/>
+              <w:left w:val="single" w:color="C9D3DC" w:sz="4"/>
+              <w:bottom w:val="single" w:color="C9D3DC" w:sz="4"/>
+              <w:right w:val="single" w:color="C9D3DC" w:sz="4"/>
+            </w:tcBorders>
+            <w:shd w:fill="FFFFFF" w:color="auto" w:val="clear"/>
+            <w:tcMar>
+              <w:top w:type="dxa" w:w="60"/>
+              <w:left w:type="dxa" w:w="100"/>
+              <w:bottom w:type="dxa" w:w="60"/>
+              <w:right w:type="dxa" w:w="100"/>
+            </w:tcMar>
+          </w:tcPr>
+          <w:p>
+            <w:pPr>
+              <w:spacing w:after="0" w:line="276"/>
+            </w:pPr>
+            <w:r>
+              <w:rPr>
+                <w:rFonts w:ascii="Microsoft JhengHei" w:cs="Microsoft JhengHei" w:eastAsia="Microsoft JhengHei" w:hAnsi="Microsoft JhengHei"/>
+                <w:b w:val="false"/>
+                <w:bCs w:val="false"/>
+                <w:color w:val="22313F"/>
+                <w:sz w:val="19"/>
+                <w:szCs w:val="19"/>
+              </w:rPr>
+              <w:t xml:space="preserve">目標</w:t>
+            </w:r>
+          </w:p>
+        </w:tc>
+        <w:tc>
+          <w:tcPr>
+            <w:tcW w:type="dxa" w:w="7326"/>
+            <w:tcBorders>
+              <w:top w:val="single" w:color="C9D3DC" w:sz="4"/>
+              <w:left w:val="single" w:color="C9D3DC" w:sz="4"/>
+              <w:bottom w:val="single" w:color="C9D3DC" w:sz="4"/>
+              <w:right w:val="single" w:color="C9D3DC" w:sz="4"/>
+            </w:tcBorders>
+            <w:shd w:fill="FFFFFF" w:color="auto" w:val="clear"/>
+            <w:tcMar>
+              <w:top w:type="dxa" w:w="60"/>
+              <w:left w:type="dxa" w:w="100"/>
+              <w:bottom w:type="dxa" w:w="60"/>
+              <w:right w:type="dxa" w:w="100"/>
+            </w:tcMar>
+          </w:tcPr>
+          <w:p>
+            <w:pPr>
+              <w:spacing w:after="0" w:line="276"/>
+            </w:pPr>
+            <w:r>
+              <w:rPr>
+                <w:rFonts w:ascii="Microsoft JhengHei" w:cs="Microsoft JhengHei" w:eastAsia="Microsoft JhengHei" w:hAnsi="Microsoft JhengHei"/>
+                <w:b w:val="false"/>
+                <w:bCs w:val="false"/>
+                <w:color w:val="22313F"/>
+                <w:sz w:val="19"/>
+                <w:szCs w:val="19"/>
+              </w:rPr>
+              <w:t xml:space="preserve">前面的 Lab 管 Kafka 的 topic 與資料;這個 Lab 把 Schema Registry(schema 與資料合約)納入同一套身分與授權,並檢查欄位級加密(CSFLE)能不能在這個環境驗證。證明四件事:① Schema Registry 的 REST 要帳密,授權由 MDS 依 AD 群組判斷(不另外維護一套帳號);② subject 的權限跟群組走:orders-write 只能碰 orders. 開頭的 subject;③ 加密金鑰(KEK)的管理權限只給 security 群組,一般開發者只能讀、沒有 role 的人連讀都不行;④ 欄位級加密本身需要企業版加上 CSFLE 加購授權——試用授權註冊帶加密規則的 schema 會被拒(402),所以加密與解密在這個環境「沒有驗證」。</w:t>
+            </w:r>
+          </w:p>
+        </w:tc>
+      </w:tr>
+      <w:tr>
+        <w:trPr>
+          <w:cantSplit/>
+          <w:tblHeader w:val="off"/>
+        </w:trPr>
+        <w:tc>
+          <w:tcPr>
+            <w:tcW w:type="dxa" w:w="1700"/>
+            <w:tcBorders>
+              <w:top w:val="single" w:color="C9D3DC" w:sz="4"/>
+              <w:left w:val="single" w:color="C9D3DC" w:sz="4"/>
+              <w:bottom w:val="single" w:color="C9D3DC" w:sz="4"/>
+              <w:right w:val="single" w:color="C9D3DC" w:sz="4"/>
+            </w:tcBorders>
+            <w:shd w:fill="F1F5F8" w:color="auto" w:val="clear"/>
+            <w:tcMar>
+              <w:top w:type="dxa" w:w="60"/>
+              <w:left w:type="dxa" w:w="100"/>
+              <w:bottom w:type="dxa" w:w="60"/>
+              <w:right w:type="dxa" w:w="100"/>
+            </w:tcMar>
+          </w:tcPr>
+          <w:p>
+            <w:pPr>
+              <w:spacing w:after="0" w:line="276"/>
+            </w:pPr>
+            <w:r>
+              <w:rPr>
+                <w:rFonts w:ascii="Microsoft JhengHei" w:cs="Microsoft JhengHei" w:eastAsia="Microsoft JhengHei" w:hAnsi="Microsoft JhengHei"/>
+                <w:b w:val="false"/>
+                <w:bCs w:val="false"/>
+                <w:color w:val="22313F"/>
+                <w:sz w:val="19"/>
+                <w:szCs w:val="19"/>
+              </w:rPr>
+              <w:t xml:space="preserve">預估時間</w:t>
+            </w:r>
+          </w:p>
+        </w:tc>
+        <w:tc>
+          <w:tcPr>
+            <w:tcW w:type="dxa" w:w="7326"/>
+            <w:tcBorders>
+              <w:top w:val="single" w:color="C9D3DC" w:sz="4"/>
+              <w:left w:val="single" w:color="C9D3DC" w:sz="4"/>
+              <w:bottom w:val="single" w:color="C9D3DC" w:sz="4"/>
+              <w:right w:val="single" w:color="C9D3DC" w:sz="4"/>
+            </w:tcBorders>
+            <w:shd w:fill="F1F5F8" w:color="auto" w:val="clear"/>
+            <w:tcMar>
+              <w:top w:type="dxa" w:w="60"/>
+              <w:left w:type="dxa" w:w="100"/>
+              <w:bottom w:type="dxa" w:w="60"/>
+              <w:right w:type="dxa" w:w="100"/>
+            </w:tcMar>
+          </w:tcPr>
+          <w:p>
+            <w:pPr>
+              <w:spacing w:after="0" w:line="276"/>
+            </w:pPr>
+            <w:r>
+              <w:rPr>
+                <w:rFonts w:ascii="Microsoft JhengHei" w:cs="Microsoft JhengHei" w:eastAsia="Microsoft JhengHei" w:hAnsi="Microsoft JhengHei"/>
+                <w:b w:val="false"/>
+                <w:bCs w:val="false"/>
+                <w:color w:val="22313F"/>
+                <w:sz w:val="19"/>
+                <w:szCs w:val="19"/>
+              </w:rPr>
+              <w:t xml:space="preserve">15 分</w:t>
+            </w:r>
+          </w:p>
+        </w:tc>
+      </w:tr>
+      <w:tr>
+        <w:trPr>
+          <w:cantSplit/>
+          <w:tblHeader w:val="off"/>
+        </w:trPr>
+        <w:tc>
+          <w:tcPr>
+            <w:tcW w:type="dxa" w:w="1700"/>
+            <w:tcBorders>
+              <w:top w:val="single" w:color="C9D3DC" w:sz="4"/>
+              <w:left w:val="single" w:color="C9D3DC" w:sz="4"/>
+              <w:bottom w:val="single" w:color="C9D3DC" w:sz="4"/>
+              <w:right w:val="single" w:color="C9D3DC" w:sz="4"/>
+            </w:tcBorders>
+            <w:shd w:fill="FFFFFF" w:color="auto" w:val="clear"/>
+            <w:tcMar>
+              <w:top w:type="dxa" w:w="60"/>
+              <w:left w:type="dxa" w:w="100"/>
+              <w:bottom w:type="dxa" w:w="60"/>
+              <w:right w:type="dxa" w:w="100"/>
+            </w:tcMar>
+          </w:tcPr>
+          <w:p>
+            <w:pPr>
+              <w:spacing w:after="0" w:line="276"/>
+            </w:pPr>
+            <w:r>
+              <w:rPr>
+                <w:rFonts w:ascii="Microsoft JhengHei" w:cs="Microsoft JhengHei" w:eastAsia="Microsoft JhengHei" w:hAnsi="Microsoft JhengHei"/>
+                <w:b w:val="false"/>
+                <w:bCs w:val="false"/>
+                <w:color w:val="22313F"/>
+                <w:sz w:val="19"/>
+                <w:szCs w:val="19"/>
+              </w:rPr>
+              <w:t xml:space="preserve">前置條件</w:t>
+            </w:r>
+          </w:p>
+        </w:tc>
+        <w:tc>
+          <w:tcPr>
+            <w:tcW w:type="dxa" w:w="7326"/>
+            <w:tcBorders>
+              <w:top w:val="single" w:color="C9D3DC" w:sz="4"/>
+              <w:left w:val="single" w:color="C9D3DC" w:sz="4"/>
+              <w:bottom w:val="single" w:color="C9D3DC" w:sz="4"/>
+              <w:right w:val="single" w:color="C9D3DC" w:sz="4"/>
+            </w:tcBorders>
+            <w:shd w:fill="FFFFFF" w:color="auto" w:val="clear"/>
+            <w:tcMar>
+              <w:top w:type="dxa" w:w="60"/>
+              <w:left w:type="dxa" w:w="100"/>
+              <w:bottom w:type="dxa" w:w="60"/>
+              <w:right w:type="dxa" w:w="100"/>
+            </w:tcMar>
+          </w:tcPr>
+          <w:p>
+            <w:pPr>
+              <w:spacing w:after="0" w:line="276"/>
+            </w:pPr>
+            <w:r>
+              <w:rPr>
+                <w:rFonts w:ascii="Microsoft JhengHei" w:cs="Microsoft JhengHei" w:eastAsia="Microsoft JhengHei" w:hAnsi="Microsoft JhengHei"/>
+                <w:b w:val="false"/>
+                <w:bCs w:val="false"/>
+                <w:color w:val="22313F"/>
+                <w:sz w:val="19"/>
+                <w:szCs w:val="19"/>
+              </w:rPr>
+              <w:t xml:space="preserve">Lab 0 完成;Lab 3 的 AD 群組(orders-write 有 yujie,topic-admin、security 有 gary)。
+Schema Registry 是 profile sr 的一個容器(約 768 MB 記憶體),本 Lab 第一步會啟動;它用 client 憑證(CN=schema-registry)向 MDS 換 token 連 Kafka,與 REST Proxy 同一種做法。SR 需要的授權(_schemas、_dek_registry 開頭的 topic、SR 叢集範圍的 SecurityAdmin 等)由 scripts/sr-setup.sh 一次補齊。
+起點狀態:Lab 之間會留下權限與群組;重做這個 Lab、或指令結果與「預期結果」不同時(例如應該被拒卻靜默成功),先在 demo 目錄執行 ./demo.sh reset 回到起點,再從本 Lab 開始。</w:t>
+            </w:r>
+          </w:p>
+        </w:tc>
+      </w:tr>
+    </w:tbl>
+    <w:p>
+      <w:pPr>
+        <w:spacing w:after="80"/>
+      </w:pPr>
+    </w:p>
+    <w:p>
+      <w:pPr>
+        <w:keepNext/>
+        <w:spacing w:after="60" w:before="120"/>
+      </w:pPr>
+      <w:r>
+        <w:rPr>
+          <w:rFonts w:ascii="Microsoft JhengHei" w:cs="Microsoft JhengHei" w:eastAsia="Microsoft JhengHei" w:hAnsi="Microsoft JhengHei"/>
+          <w:b/>
+          <w:bCs/>
+          <w:color w:val="1E7B3A"/>
+          <w:sz w:val="20"/>
+          <w:szCs w:val="20"/>
+        </w:rPr>
+        <w:t xml:space="preserve">整個 Lab 一鍵跑完(專案包好的指令)</w:t>
+      </w:r>
+    </w:p>
+    <w:p>
+      <w:pPr>
+        <w:pBdr>
+          <w:top w:val="none" w:color="FFFFFF" w:sz="0"/>
+          <w:left w:val="single" w:color="1E7B3A" w:sz="18" w:space="6"/>
+          <w:bottom w:val="none" w:color="FFFFFF" w:sz="0"/>
+          <w:right w:val="none" w:color="FFFFFF" w:sz="0"/>
+        </w:pBdr>
+        <w:shd w:fill="F1F4F7" w:color="auto" w:val="clear"/>
+        <w:spacing w:after="0" w:line="252"/>
+        <w:ind w:left="140" w:right="60"/>
+      </w:pPr>
+      <w:r>
+        <w:rPr>
+          <w:rFonts w:ascii="Consolas" w:cs="Consolas" w:eastAsia="Consolas" w:hAnsi="Consolas"/>
+          <w:color w:val="1B2733"/>
+          <w:sz w:val="17"/>
+          <w:szCs w:val="17"/>
+        </w:rPr>
+        <w:t xml:space="preserve">./demo.sh 20</w:t>
+      </w:r>
+    </w:p>
+    <w:p>
+      <w:pPr>
+        <w:pBdr>
+          <w:top w:val="none" w:color="FFFFFF" w:sz="0"/>
+          <w:left w:val="single" w:color="1E7B3A" w:sz="18" w:space="6"/>
+          <w:bottom w:val="none" w:color="FFFFFF" w:sz="0"/>
+          <w:right w:val="none" w:color="FFFFFF" w:sz="0"/>
+        </w:pBdr>
+        <w:shd w:fill="F1F4F7" w:color="auto" w:val="clear"/>
+        <w:spacing w:after="0" w:line="252"/>
+        <w:ind w:left="140" w:right="60"/>
+      </w:pPr>
+      <w:r>
+        <w:rPr>
+          <w:rFonts w:ascii="Consolas" w:cs="Consolas" w:eastAsia="Consolas" w:hAnsi="Consolas"/>
+          <w:color w:val="1B2733"/>
+          <w:sz w:val="17"/>
+          <w:szCs w:val="17"/>
+        </w:rPr>
+        <w:t xml:space="preserve">./scenarios/ch20-schema-registry.sh</w:t>
+      </w:r>
+    </w:p>
+    <w:p>
+      <w:pPr>
+        <w:spacing w:after="80"/>
+      </w:pPr>
+    </w:p>
+    <w:p>
+      <w:pPr>
+        <w:pStyle w:val="Heading3"/>
+        <w:keepNext/>
+      </w:pPr>
+      <w:r>
+        <w:rPr>
+          <w:rFonts w:ascii="Microsoft JhengHei" w:cs="Microsoft JhengHei" w:eastAsia="Microsoft JhengHei" w:hAnsi="Microsoft JhengHei"/>
+        </w:rPr>
+        <w:t xml:space="preserve">20.1 啟動 Schema Registry 並完成授權</w:t>
+      </w:r>
+    </w:p>
+    <w:p>
+      <w:pPr>
+        <w:spacing w:after="100" w:line="300"/>
+      </w:pPr>
+      <w:r>
+        <w:rPr>
+          <w:rFonts w:ascii="Microsoft JhengHei" w:cs="Microsoft JhengHei" w:eastAsia="Microsoft JhengHei" w:hAnsi="Microsoft JhengHei"/>
+          <w:sz w:val="21"/>
+          <w:szCs w:val="21"/>
+        </w:rPr>
+        <w:t xml:space="preserve">兩件事:讓 SR 自己能存取 Kafka(它的身分是憑證 CN=schema-registry,不是 AD 帳號),以及依 AD 群組給人授權。SR 在 compose 裡要開三個 resource extension:安全(RBAC)、DEK Registry(KEK / DEK 管理)、RuleSet(資料合約的規則)。少一個就會有不同的問題,見下面的警告。</w:t>
+      </w:r>
+    </w:p>
+    <w:p>
+      <w:pPr>
+        <w:keepNext/>
+        <w:spacing w:after="60" w:before="120"/>
+      </w:pPr>
+      <w:r>
+        <w:rPr>
+          <w:rFonts w:ascii="Microsoft JhengHei" w:cs="Microsoft JhengHei" w:eastAsia="Microsoft JhengHei" w:hAnsi="Microsoft JhengHei"/>
+          <w:b/>
+          <w:bCs/>
+          <w:color w:val="1F7A8C"/>
+          <w:sz w:val="20"/>
+          <w:szCs w:val="20"/>
+        </w:rPr>
+        <w:t xml:space="preserve">手動指令</w:t>
+      </w:r>
+    </w:p>
+    <w:p>
+      <w:pPr>
+        <w:pBdr>
+          <w:top w:val="none" w:color="FFFFFF" w:sz="0"/>
+          <w:left w:val="single" w:color="1F7A8C" w:sz="18" w:space="6"/>
+          <w:bottom w:val="none" w:color="FFFFFF" w:sz="0"/>
+          <w:right w:val="none" w:color="FFFFFF" w:sz="0"/>
+        </w:pBdr>
+        <w:shd w:fill="F1F4F7" w:color="auto" w:val="clear"/>
+        <w:spacing w:after="0" w:line="252"/>
+        <w:ind w:left="140" w:right="60"/>
+      </w:pPr>
+      <w:r>
+        <w:rPr>
+          <w:rFonts w:ascii="Consolas" w:cs="Consolas" w:eastAsia="Consolas" w:hAnsi="Consolas"/>
+          <w:color w:val="1B2733"/>
+          <w:sz w:val="17"/>
+          <w:szCs w:val="17"/>
+        </w:rPr>
+        <w:t xml:space="preserve">bash scripts/sr-setup.sh</w:t>
+      </w:r>
+    </w:p>
+    <w:p>
+      <w:pPr>
+        <w:spacing w:after="80"/>
+      </w:pPr>
+    </w:p>
+    <w:p>
+      <w:pPr>
+        <w:spacing w:after="100" w:line="300"/>
+      </w:pPr>
+      <w:r>
+        <w:rPr>
+          <w:rFonts w:ascii="Microsoft JhengHei" w:cs="Microsoft JhengHei" w:eastAsia="Microsoft JhengHei" w:hAnsi="Microsoft JhengHei"/>
+          <w:b/>
+          <w:bCs/>
+          <w:color w:val="B7791F"/>
+          <w:sz w:val="21"/>
+          <w:szCs w:val="21"/>
+        </w:rPr>
+        <w:t xml:space="preserve">預期:</w:t>
+      </w:r>
+      <w:r>
+        <w:rPr>
+          <w:rFonts w:ascii="Microsoft JhengHei" w:cs="Microsoft JhengHei" w:eastAsia="Microsoft JhengHei" w:hAnsi="Microsoft JhengHei"/>
+          <w:sz w:val="21"/>
+          <w:szCs w:val="21"/>
+        </w:rPr>
+        <w:t xml:space="preserve">授權逐項 [HTTP 204];Schema Registry Healthy;最後印「就緒(gary 可列 KEK)」。</w:t>
+      </w:r>
+    </w:p>
+    <w:tbl>
+      <w:tblPr>
+        <w:tblW w:type="dxa" w:w="9026"/>
+        <w:tblBorders>
+          <w:top w:val="single" w:color="auto" w:sz="4"/>
+          <w:left w:val="single" w:color="auto" w:sz="4"/>
+          <w:bottom w:val="single" w:color="auto" w:sz="4"/>
+          <w:right w:val="single" w:color="auto" w:sz="4"/>
+          <w:insideH w:val="single" w:color="auto" w:sz="4"/>
+          <w:insideV w:val="single" w:color="auto" w:sz="4"/>
+        </w:tblBorders>
+      </w:tblPr>
+      <w:tblGrid>
+        <w:gridCol w:w="9026"/>
+      </w:tblGrid>
+      <w:tr>
+        <w:tc>
+          <w:tcPr>
+            <w:tcW w:type="dxa" w:w="9026"/>
+            <w:tcBorders>
+              <w:top w:val="single" w:color="D5DEE6" w:sz="4"/>
+              <w:left w:val="single" w:color="B03A2E" w:sz="24"/>
+              <w:bottom w:val="single" w:color="D5DEE6" w:sz="4"/>
+              <w:right w:val="single" w:color="D5DEE6" w:sz="4"/>
+            </w:tcBorders>
+            <w:shd w:fill="FDECEA" w:color="auto" w:val="clear"/>
+            <w:tcMar>
+              <w:top w:type="dxa" w:w="80"/>
+              <w:left w:type="dxa" w:w="140"/>
+              <w:bottom w:type="dxa" w:w="80"/>
+              <w:right w:type="dxa" w:w="140"/>
+            </w:tcMar>
+          </w:tcPr>
+          <w:p>
+            <w:pPr>
+              <w:spacing w:after="0" w:line="288"/>
+            </w:pPr>
+            <w:r>
+              <w:rPr>
+                <w:rFonts w:ascii="Microsoft JhengHei" w:cs="Microsoft JhengHei" w:eastAsia="Microsoft JhengHei" w:hAnsi="Microsoft JhengHei"/>
+                <w:b/>
+                <w:bCs/>
+                <w:color w:val="B03A2E"/>
+                <w:sz w:val="20"/>
+                <w:szCs w:val="20"/>
+              </w:rPr>
+              <w:t xml:space="preserve">注意:</w:t>
+            </w:r>
+            <w:r>
+              <w:rPr>
+                <w:rFonts w:ascii="Microsoft JhengHei" w:cs="Microsoft JhengHei" w:eastAsia="Microsoft JhengHei" w:hAnsi="Microsoft JhengHei"/>
+                <w:sz w:val="20"/>
+                <w:szCs w:val="20"/>
+              </w:rPr>
+              <w:t xml:space="preserve">實測踩到的坑(都已在 compose 與 sr-setup.sh 處理):① 只開 HTTPS 時要設 inter.instance.protocol=https,否則啟動失敗;② 啟動前檢查要有 CUB_CLASSPATH(含 confluent-security 的 jar),否則找不到 TokenCertificateLoginCallbackHandler;③ DEK Registry 要自己的 topic(_dek_registry_keys),SR 的身分要有 _dek_registry 開頭的 ResourceOwner,否則啟動失敗;④ 要開 dek.registry.rbac.enable=true,否則 KEK 端點對所有人 403(日誌:Couldn't find a corresponding operation to authorize);⑤ SR 的身分要有 SR 叢集範圍的 SecurityAdmin 才能代使用者向 MDS 查授權,否則 KEK 端點回 500;⑥ 沒有開 RuleSet extension 時,註冊帶規則的 schema 會「默默丟掉規則、不報錯」(第 20.5 說明為什麼危險)。</w:t>
+            </w:r>
+          </w:p>
+        </w:tc>
+      </w:tr>
+    </w:tbl>
+    <w:p>
+      <w:pPr>
+        <w:spacing w:after="80"/>
+      </w:pPr>
+    </w:p>
+    <w:p>
+      <w:pPr>
+        <w:pStyle w:val="Heading3"/>
+        <w:keepNext/>
+      </w:pPr>
+      <w:r>
+        <w:rPr>
+          <w:rFonts w:ascii="Microsoft JhengHei" w:cs="Microsoft JhengHei" w:eastAsia="Microsoft JhengHei" w:hAnsi="Microsoft JhengHei"/>
+        </w:rPr>
+        <w:t xml:space="preserve">20.2 認證:不帶帳密與密碼錯誤都被擋</w:t>
+      </w:r>
+    </w:p>
+    <w:p>
+      <w:pPr>
+        <w:spacing w:after="100" w:line="300"/>
+      </w:pPr>
+      <w:r>
+        <w:rPr>
+          <w:rFonts w:ascii="Microsoft JhengHei" w:cs="Microsoft JhengHei" w:eastAsia="Microsoft JhengHei" w:hAnsi="Microsoft JhengHei"/>
+          <w:sz w:val="21"/>
+          <w:szCs w:val="21"/>
+        </w:rPr>
+        <w:t xml:space="preserve">Schema Registry 的 REST 和 MDS、REST Proxy 一樣:不帶帳密 401、密碼錯 401。帳密就是 AD 帳密(Basic),SR 把它交給 MDS 驗證,SR 自己不存任何帳號。</w:t>
+      </w:r>
+    </w:p>
+    <w:p>
+      <w:pPr>
+        <w:keepNext/>
+        <w:spacing w:after="60" w:before="120"/>
+      </w:pPr>
+      <w:r>
+        <w:rPr>
+          <w:rFonts w:ascii="Microsoft JhengHei" w:cs="Microsoft JhengHei" w:eastAsia="Microsoft JhengHei" w:hAnsi="Microsoft JhengHei"/>
+          <w:b/>
+          <w:bCs/>
+          <w:color w:val="1F7A8C"/>
+          <w:sz w:val="20"/>
+          <w:szCs w:val="20"/>
+        </w:rPr>
+        <w:t xml:space="preserve">手動指令</w:t>
+      </w:r>
+    </w:p>
+    <w:p>
+      <w:pPr>
+        <w:pBdr>
+          <w:top w:val="none" w:color="FFFFFF" w:sz="0"/>
+          <w:left w:val="single" w:color="1F7A8C" w:sz="18" w:space="6"/>
+          <w:bottom w:val="none" w:color="FFFFFF" w:sz="0"/>
+          <w:right w:val="none" w:color="FFFFFF" w:sz="0"/>
+        </w:pBdr>
+        <w:shd w:fill="F1F4F7" w:color="auto" w:val="clear"/>
+        <w:spacing w:after="0" w:line="252"/>
+        <w:ind w:left="140" w:right="60"/>
+      </w:pPr>
+      <w:r>
+        <w:rPr>
+          <w:rFonts w:ascii="Consolas" w:cs="Consolas" w:eastAsia="Consolas" w:hAnsi="Consolas"/>
+          <w:color w:val="1B2733"/>
+          <w:sz w:val="17"/>
+          <w:szCs w:val="17"/>
+        </w:rPr>
+        <w:t xml:space="preserve">hc https://schema-registry:8081/subjects</w:t>
+      </w:r>
+    </w:p>
+    <w:p>
+      <w:pPr>
+        <w:pBdr>
+          <w:top w:val="none" w:color="FFFFFF" w:sz="0"/>
+          <w:left w:val="single" w:color="1F7A8C" w:sz="18" w:space="6"/>
+          <w:bottom w:val="none" w:color="FFFFFF" w:sz="0"/>
+          <w:right w:val="none" w:color="FFFFFF" w:sz="0"/>
+        </w:pBdr>
+        <w:shd w:fill="F1F4F7" w:color="auto" w:val="clear"/>
+        <w:spacing w:after="0" w:line="252"/>
+        <w:ind w:left="140" w:right="60"/>
+      </w:pPr>
+      <w:r>
+        <w:rPr>
+          <w:rFonts w:ascii="Consolas" w:cs="Consolas" w:eastAsia="Consolas" w:hAnsi="Consolas"/>
+          <w:color w:val="1B2733"/>
+          <w:sz w:val="17"/>
+          <w:szCs w:val="17"/>
+        </w:rPr>
+        <w:t xml:space="preserve">hc -u gary:bad https://schema-registry:8081/subjects</w:t>
+      </w:r>
+    </w:p>
+    <w:p>
+      <w:pPr>
+        <w:pBdr>
+          <w:top w:val="none" w:color="FFFFFF" w:sz="0"/>
+          <w:left w:val="single" w:color="1F7A8C" w:sz="18" w:space="6"/>
+          <w:bottom w:val="none" w:color="FFFFFF" w:sz="0"/>
+          <w:right w:val="none" w:color="FFFFFF" w:sz="0"/>
+        </w:pBdr>
+        <w:shd w:fill="F1F4F7" w:color="auto" w:val="clear"/>
+        <w:spacing w:after="0" w:line="252"/>
+        <w:ind w:left="140" w:right="60"/>
+      </w:pPr>
+      <w:r>
+        <w:rPr>
+          <w:rFonts w:ascii="Consolas" w:cs="Consolas" w:eastAsia="Consolas" w:hAnsi="Consolas"/>
+          <w:color w:val="1B2733"/>
+          <w:sz w:val="17"/>
+          <w:szCs w:val="17"/>
+        </w:rPr>
+        <w:t xml:space="preserve">hc -u gary:gary-pw https://schema-registry:8081/subjects</w:t>
+      </w:r>
+    </w:p>
+    <w:p>
+      <w:pPr>
+        <w:spacing w:after="80"/>
+      </w:pPr>
+    </w:p>
+    <w:p>
+      <w:pPr>
+        <w:spacing w:after="100" w:line="300"/>
+      </w:pPr>
+      <w:r>
+        <w:rPr>
+          <w:rFonts w:ascii="Microsoft JhengHei" w:cs="Microsoft JhengHei" w:eastAsia="Microsoft JhengHei" w:hAnsi="Microsoft JhengHei"/>
+          <w:b/>
+          <w:bCs/>
+          <w:color w:val="B7791F"/>
+          <w:sz w:val="21"/>
+          <w:szCs w:val="21"/>
+        </w:rPr>
+        <w:t xml:space="preserve">預期:</w:t>
+      </w:r>
+      <w:r>
+        <w:rPr>
+          <w:rFonts w:ascii="Microsoft JhengHei" w:cs="Microsoft JhengHei" w:eastAsia="Microsoft JhengHei" w:hAnsi="Microsoft JhengHei"/>
+          <w:sz w:val="21"/>
+          <w:szCs w:val="21"/>
+        </w:rPr>
+        <w:t xml:space="preserve">不帶帳密 [HTTP 401];密碼錯 [HTTP 401];gary 正確 [HTTP 200]。</w:t>
+      </w:r>
+    </w:p>
+    <w:p>
+      <w:pPr>
+        <w:pStyle w:val="Heading3"/>
+        <w:keepNext/>
+      </w:pPr>
+      <w:r>
+        <w:rPr>
+          <w:rFonts w:ascii="Microsoft JhengHei" w:cs="Microsoft JhengHei" w:eastAsia="Microsoft JhengHei" w:hAnsi="Microsoft JhengHei"/>
+        </w:rPr>
+        <w:t xml:space="preserve">20.3 subject 授權:跟著 AD 群組走</w:t>
+      </w:r>
+    </w:p>
+    <w:p>
+      <w:pPr>
+        <w:spacing w:after="100" w:line="300"/>
+      </w:pPr>
+      <w:r>
+        <w:rPr>
+          <w:rFonts w:ascii="Microsoft JhengHei" w:cs="Microsoft JhengHei" w:eastAsia="Microsoft JhengHei" w:hAnsi="Microsoft JhengHei"/>
+          <w:sz w:val="21"/>
+          <w:szCs w:val="21"/>
+        </w:rPr>
+        <w:t xml:space="preserve">topic-admin(gary)對所有 subject 是 ResourceOwner;orders-write(yujie)只對 orders. 開頭的 subject 有讀寫。所以 yujie 可以註冊 orders.events-value,註冊 payments.events-value 被拒;列出 subject 時,每個人只看到自己有權限的;沒有任何群組的 ming 什麼都看不到。</w:t>
+      </w:r>
+    </w:p>
+    <w:p>
+      <w:pPr>
+        <w:keepNext/>
+        <w:spacing w:after="60" w:before="120"/>
+      </w:pPr>
+      <w:r>
+        <w:rPr>
+          <w:rFonts w:ascii="Microsoft JhengHei" w:cs="Microsoft JhengHei" w:eastAsia="Microsoft JhengHei" w:hAnsi="Microsoft JhengHei"/>
+          <w:b/>
+          <w:bCs/>
+          <w:color w:val="1F7A8C"/>
+          <w:sz w:val="20"/>
+          <w:szCs w:val="20"/>
+        </w:rPr>
+        <w:t xml:space="preserve">手動指令</w:t>
+      </w:r>
+    </w:p>
+    <w:p>
+      <w:pPr>
+        <w:pBdr>
+          <w:top w:val="none" w:color="FFFFFF" w:sz="0"/>
+          <w:left w:val="single" w:color="1F7A8C" w:sz="18" w:space="6"/>
+          <w:bottom w:val="none" w:color="FFFFFF" w:sz="0"/>
+          <w:right w:val="none" w:color="FFFFFF" w:sz="0"/>
+        </w:pBdr>
+        <w:shd w:fill="F1F4F7" w:color="auto" w:val="clear"/>
+        <w:spacing w:after="0" w:line="252"/>
+        <w:ind w:left="140" w:right="60"/>
+      </w:pPr>
+      <w:r>
+        <w:rPr>
+          <w:rFonts w:ascii="Consolas" w:cs="Consolas" w:eastAsia="Consolas" w:hAnsi="Consolas"/>
+          <w:color w:val="1B2733"/>
+          <w:sz w:val="17"/>
+          <w:szCs w:val="17"/>
+        </w:rPr>
+        <w:t xml:space="preserve">J='Content-Type: application/vnd.schemaregistry.v1+json'</w:t>
+      </w:r>
+    </w:p>
+    <w:p>
+      <w:pPr>
+        <w:pBdr>
+          <w:top w:val="none" w:color="FFFFFF" w:sz="0"/>
+          <w:left w:val="single" w:color="1F7A8C" w:sz="18" w:space="6"/>
+          <w:bottom w:val="none" w:color="FFFFFF" w:sz="0"/>
+          <w:right w:val="none" w:color="FFFFFF" w:sz="0"/>
+        </w:pBdr>
+        <w:shd w:fill="F1F4F7" w:color="auto" w:val="clear"/>
+        <w:spacing w:after="0" w:line="252"/>
+        <w:ind w:left="140" w:right="60"/>
+      </w:pPr>
+      <w:r>
+        <w:rPr>
+          <w:rFonts w:ascii="Consolas" w:cs="Consolas" w:eastAsia="Consolas" w:hAnsi="Consolas"/>
+          <w:color w:val="1B2733"/>
+          <w:sz w:val="17"/>
+          <w:szCs w:val="17"/>
+        </w:rPr>
+        <w:t xml:space="preserve">ORDER_BODY='{"schemaType":"AVRO","schema":"{\"type\":\"record\",\"name\":\"Order\",\"namespace\":\"demo\",\"fields\":[{\"name\":\"id\",\"type\":\"string\"},{\"name\":\"amount\",\"type\":\"int\"},{\"name\":\"card_no\",\"type\":\"string\",\"confluent:tags\":[\"PII\"]}]}"}'</w:t>
+      </w:r>
+    </w:p>
+    <w:p>
+      <w:pPr>
+        <w:pBdr>
+          <w:top w:val="none" w:color="FFFFFF" w:sz="0"/>
+          <w:left w:val="single" w:color="1F7A8C" w:sz="18" w:space="6"/>
+          <w:bottom w:val="none" w:color="FFFFFF" w:sz="0"/>
+          <w:right w:val="none" w:color="FFFFFF" w:sz="0"/>
+        </w:pBdr>
+        <w:shd w:fill="F1F4F7" w:color="auto" w:val="clear"/>
+        <w:spacing w:after="0" w:line="252"/>
+        <w:ind w:left="140" w:right="60"/>
+      </w:pPr>
+      <w:r>
+        <w:rPr>
+          <w:rFonts w:ascii="Consolas" w:cs="Consolas" w:eastAsia="Consolas" w:hAnsi="Consolas"/>
+          <w:color w:val="1B2733"/>
+          <w:sz w:val="17"/>
+          <w:szCs w:val="17"/>
+        </w:rPr>
+        <w:t xml:space="preserve">hc -u gary:gary-pw -X POST -H "$J" -d "$ORDER_BODY" https://schema-registry:8081/subjects/payments.events-value/versions | tail -1</w:t>
+      </w:r>
+    </w:p>
+    <w:p>
+      <w:pPr>
+        <w:pBdr>
+          <w:top w:val="none" w:color="FFFFFF" w:sz="0"/>
+          <w:left w:val="single" w:color="1F7A8C" w:sz="18" w:space="6"/>
+          <w:bottom w:val="none" w:color="FFFFFF" w:sz="0"/>
+          <w:right w:val="none" w:color="FFFFFF" w:sz="0"/>
+        </w:pBdr>
+        <w:shd w:fill="F1F4F7" w:color="auto" w:val="clear"/>
+        <w:spacing w:after="0" w:line="252"/>
+        <w:ind w:left="140" w:right="60"/>
+      </w:pPr>
+      <w:r>
+        <w:rPr>
+          <w:rFonts w:ascii="Consolas" w:cs="Consolas" w:eastAsia="Consolas" w:hAnsi="Consolas"/>
+          <w:color w:val="1B2733"/>
+          <w:sz w:val="17"/>
+          <w:szCs w:val="17"/>
+        </w:rPr>
+        <w:t xml:space="preserve">hc -u yujie:yujie-pw -X POST -H "$J" -d "$ORDER_BODY" https://schema-registry:8081/subjects/orders.events-value/versions | tail -1</w:t>
+      </w:r>
+    </w:p>
+    <w:p>
+      <w:pPr>
+        <w:pBdr>
+          <w:top w:val="none" w:color="FFFFFF" w:sz="0"/>
+          <w:left w:val="single" w:color="1F7A8C" w:sz="18" w:space="6"/>
+          <w:bottom w:val="none" w:color="FFFFFF" w:sz="0"/>
+          <w:right w:val="none" w:color="FFFFFF" w:sz="0"/>
+        </w:pBdr>
+        <w:shd w:fill="F1F4F7" w:color="auto" w:val="clear"/>
+        <w:spacing w:after="0" w:line="252"/>
+        <w:ind w:left="140" w:right="60"/>
+      </w:pPr>
+      <w:r>
+        <w:rPr>
+          <w:rFonts w:ascii="Consolas" w:cs="Consolas" w:eastAsia="Consolas" w:hAnsi="Consolas"/>
+          <w:color w:val="1B2733"/>
+          <w:sz w:val="17"/>
+          <w:szCs w:val="17"/>
+        </w:rPr>
+        <w:t xml:space="preserve">hc -u yujie:yujie-pw -X POST -H "$J" -d "$ORDER_BODY" https://schema-registry:8081/subjects/payments.events-value/versions | tail -1</w:t>
+      </w:r>
+    </w:p>
+    <w:p>
+      <w:pPr>
+        <w:pBdr>
+          <w:top w:val="none" w:color="FFFFFF" w:sz="0"/>
+          <w:left w:val="single" w:color="1F7A8C" w:sz="18" w:space="6"/>
+          <w:bottom w:val="none" w:color="FFFFFF" w:sz="0"/>
+          <w:right w:val="none" w:color="FFFFFF" w:sz="0"/>
+        </w:pBdr>
+        <w:shd w:fill="F1F4F7" w:color="auto" w:val="clear"/>
+        <w:spacing w:after="0" w:line="252"/>
+        <w:ind w:left="140" w:right="60"/>
+      </w:pPr>
+      <w:r>
+        <w:rPr>
+          <w:rFonts w:ascii="Consolas" w:cs="Consolas" w:eastAsia="Consolas" w:hAnsi="Consolas"/>
+          <w:color w:val="1B2733"/>
+          <w:sz w:val="17"/>
+          <w:szCs w:val="17"/>
+        </w:rPr>
+        <w:t xml:space="preserve">echo "gary 列 subject:"; hc -u gary:gary-pw https://schema-registry:8081/subjects</w:t>
+      </w:r>
+    </w:p>
+    <w:p>
+      <w:pPr>
+        <w:pBdr>
+          <w:top w:val="none" w:color="FFFFFF" w:sz="0"/>
+          <w:left w:val="single" w:color="1F7A8C" w:sz="18" w:space="6"/>
+          <w:bottom w:val="none" w:color="FFFFFF" w:sz="0"/>
+          <w:right w:val="none" w:color="FFFFFF" w:sz="0"/>
+        </w:pBdr>
+        <w:shd w:fill="F1F4F7" w:color="auto" w:val="clear"/>
+        <w:spacing w:after="0" w:line="252"/>
+        <w:ind w:left="140" w:right="60"/>
+      </w:pPr>
+      <w:r>
+        <w:rPr>
+          <w:rFonts w:ascii="Consolas" w:cs="Consolas" w:eastAsia="Consolas" w:hAnsi="Consolas"/>
+          <w:color w:val="1B2733"/>
+          <w:sz w:val="17"/>
+          <w:szCs w:val="17"/>
+        </w:rPr>
+        <w:t xml:space="preserve">echo "yujie 列 subject:"; hc -u yujie:yujie-pw https://schema-registry:8081/subjects</w:t>
+      </w:r>
+    </w:p>
+    <w:p>
+      <w:pPr>
+        <w:pBdr>
+          <w:top w:val="none" w:color="FFFFFF" w:sz="0"/>
+          <w:left w:val="single" w:color="1F7A8C" w:sz="18" w:space="6"/>
+          <w:bottom w:val="none" w:color="FFFFFF" w:sz="0"/>
+          <w:right w:val="none" w:color="FFFFFF" w:sz="0"/>
+        </w:pBdr>
+        <w:shd w:fill="F1F4F7" w:color="auto" w:val="clear"/>
+        <w:spacing w:after="0" w:line="252"/>
+        <w:ind w:left="140" w:right="60"/>
+      </w:pPr>
+      <w:r>
+        <w:rPr>
+          <w:rFonts w:ascii="Consolas" w:cs="Consolas" w:eastAsia="Consolas" w:hAnsi="Consolas"/>
+          <w:color w:val="1B2733"/>
+          <w:sz w:val="17"/>
+          <w:szCs w:val="17"/>
+        </w:rPr>
+        <w:t xml:space="preserve">echo "ming 列 subject:"; hc -u ming:ming-pw https://schema-registry:8081/subjects</w:t>
+      </w:r>
+    </w:p>
+    <w:p>
+      <w:pPr>
+        <w:spacing w:after="80"/>
+      </w:pPr>
+    </w:p>
+    <w:p>
+      <w:pPr>
+        <w:spacing w:after="100" w:line="300"/>
+      </w:pPr>
+      <w:r>
+        <w:rPr>
+          <w:rFonts w:ascii="Microsoft JhengHei" w:cs="Microsoft JhengHei" w:eastAsia="Microsoft JhengHei" w:hAnsi="Microsoft JhengHei"/>
+          <w:b/>
+          <w:bCs/>
+          <w:color w:val="B7791F"/>
+          <w:sz w:val="21"/>
+          <w:szCs w:val="21"/>
+        </w:rPr>
+        <w:t xml:space="preserve">預期:</w:t>
+      </w:r>
+      <w:r>
+        <w:rPr>
+          <w:rFonts w:ascii="Microsoft JhengHei" w:cs="Microsoft JhengHei" w:eastAsia="Microsoft JhengHei" w:hAnsi="Microsoft JhengHei"/>
+          <w:sz w:val="21"/>
+          <w:szCs w:val="21"/>
+        </w:rPr>
+        <w:t xml:space="preserve">gary 註冊 payments 200;yujie 註冊 orders 200;yujie 註冊 payments [HTTP 403];gary 看到兩個 subject;yujie 只看到 ["orders.events-value"];ming 看到 []。</w:t>
+      </w:r>
+    </w:p>
+    <w:tbl>
+      <w:tblPr>
+        <w:tblW w:type="dxa" w:w="9026"/>
+        <w:tblBorders>
+          <w:top w:val="single" w:color="auto" w:sz="4"/>
+          <w:left w:val="single" w:color="auto" w:sz="4"/>
+          <w:bottom w:val="single" w:color="auto" w:sz="4"/>
+          <w:right w:val="single" w:color="auto" w:sz="4"/>
+          <w:insideH w:val="single" w:color="auto" w:sz="4"/>
+          <w:insideV w:val="single" w:color="auto" w:sz="4"/>
+        </w:tblBorders>
+      </w:tblPr>
+      <w:tblGrid>
+        <w:gridCol w:w="9026"/>
+      </w:tblGrid>
+      <w:tr>
+        <w:tc>
+          <w:tcPr>
+            <w:tcW w:type="dxa" w:w="9026"/>
+            <w:tcBorders>
+              <w:top w:val="single" w:color="D5DEE6" w:sz="4"/>
+              <w:left w:val="single" w:color="1F7A8C" w:sz="24"/>
+              <w:bottom w:val="single" w:color="D5DEE6" w:sz="4"/>
+              <w:right w:val="single" w:color="D5DEE6" w:sz="4"/>
+            </w:tcBorders>
+            <w:shd w:fill="E8F4F7" w:color="auto" w:val="clear"/>
+            <w:tcMar>
+              <w:top w:type="dxa" w:w="80"/>
+              <w:left w:type="dxa" w:w="140"/>
+              <w:bottom w:type="dxa" w:w="80"/>
+              <w:right w:type="dxa" w:w="140"/>
+            </w:tcMar>
+          </w:tcPr>
+          <w:p>
+            <w:pPr>
+              <w:spacing w:after="0" w:line="288"/>
+            </w:pPr>
+            <w:r>
+              <w:rPr>
+                <w:rFonts w:ascii="Microsoft JhengHei" w:cs="Microsoft JhengHei" w:eastAsia="Microsoft JhengHei" w:hAnsi="Microsoft JhengHei"/>
+                <w:b/>
+                <w:bCs/>
+                <w:color w:val="1F7A8C"/>
+                <w:sz w:val="20"/>
+                <w:szCs w:val="20"/>
+              </w:rPr>
+              <w:t xml:space="preserve">提示:</w:t>
+            </w:r>
+            <w:r>
+              <w:rPr>
+                <w:rFonts w:ascii="Microsoft JhengHei" w:cs="Microsoft JhengHei" w:eastAsia="Microsoft JhengHei" w:hAnsi="Microsoft JhengHei"/>
+                <w:sz w:val="20"/>
+                <w:szCs w:val="20"/>
+              </w:rPr>
+              <w:t xml:space="preserve">這個 schema 的 card_no 欄位標了 PII(Avro 的 confluent:tags)。標籤本身不加密任何東西——它只是讓「規則」知道要加密哪些欄位。</w:t>
+            </w:r>
+          </w:p>
+        </w:tc>
+      </w:tr>
+    </w:tbl>
+    <w:p>
+      <w:pPr>
+        <w:spacing w:after="80"/>
+      </w:pPr>
+    </w:p>
+    <w:p>
+      <w:pPr>
+        <w:pStyle w:val="Heading3"/>
+        <w:keepNext/>
+      </w:pPr>
+      <w:r>
+        <w:rPr>
+          <w:rFonts w:ascii="Microsoft JhengHei" w:cs="Microsoft JhengHei" w:eastAsia="Microsoft JhengHei" w:hAnsi="Microsoft JhengHei"/>
+        </w:rPr>
+        <w:t xml:space="preserve">20.4 KEK 授權:誰能建金鑰、誰能讀</w:t>
+      </w:r>
+    </w:p>
+    <w:p>
+      <w:pPr>
+        <w:spacing w:after="100" w:line="300"/>
+      </w:pPr>
+      <w:r>
+        <w:rPr>
+          <w:rFonts w:ascii="Microsoft JhengHei" w:cs="Microsoft JhengHei" w:eastAsia="Microsoft JhengHei" w:hAnsi="Microsoft JhengHei"/>
+          <w:sz w:val="21"/>
+          <w:szCs w:val="21"/>
+        </w:rPr>
+        <w:t xml:space="preserve">KEK(key encryption key)是欄位加密的根。資源名稱是 Kek:&lt;名稱&gt;,授權也走 role:security 群組(gary)是 ResourceOwner,可以建;orders-write(yujie)只被授權讀 orders-kek,建別的 KEK 被拒;沒有任何 role 的 ming 連讀都被拒。這裡用 local-kms(Confluent 提供的「僅供測試」KMS 型態),正式環境要接 KMS / HSM。</w:t>
+      </w:r>
+    </w:p>
+    <w:p>
+      <w:pPr>
+        <w:keepNext/>
+        <w:spacing w:after="60" w:before="120"/>
+      </w:pPr>
+      <w:r>
+        <w:rPr>
+          <w:rFonts w:ascii="Microsoft JhengHei" w:cs="Microsoft JhengHei" w:eastAsia="Microsoft JhengHei" w:hAnsi="Microsoft JhengHei"/>
+          <w:b/>
+          <w:bCs/>
+          <w:color w:val="1F7A8C"/>
+          <w:sz w:val="20"/>
+          <w:szCs w:val="20"/>
+        </w:rPr>
+        <w:t xml:space="preserve">手動指令</w:t>
+      </w:r>
+    </w:p>
+    <w:p>
+      <w:pPr>
+        <w:pBdr>
+          <w:top w:val="none" w:color="FFFFFF" w:sz="0"/>
+          <w:left w:val="single" w:color="1F7A8C" w:sz="18" w:space="6"/>
+          <w:bottom w:val="none" w:color="FFFFFF" w:sz="0"/>
+          <w:right w:val="none" w:color="FFFFFF" w:sz="0"/>
+        </w:pBdr>
+        <w:shd w:fill="F1F4F7" w:color="auto" w:val="clear"/>
+        <w:spacing w:after="0" w:line="252"/>
+        <w:ind w:left="140" w:right="60"/>
+      </w:pPr>
+      <w:r>
+        <w:rPr>
+          <w:rFonts w:ascii="Consolas" w:cs="Consolas" w:eastAsia="Consolas" w:hAnsi="Consolas"/>
+          <w:color w:val="1B2733"/>
+          <w:sz w:val="17"/>
+          <w:szCs w:val="17"/>
+        </w:rPr>
+        <w:t xml:space="preserve">J='Content-Type: application/vnd.schemaregistry.v1+json'</w:t>
+      </w:r>
+    </w:p>
+    <w:p>
+      <w:pPr>
+        <w:pBdr>
+          <w:top w:val="none" w:color="FFFFFF" w:sz="0"/>
+          <w:left w:val="single" w:color="1F7A8C" w:sz="18" w:space="6"/>
+          <w:bottom w:val="none" w:color="FFFFFF" w:sz="0"/>
+          <w:right w:val="none" w:color="FFFFFF" w:sz="0"/>
+        </w:pBdr>
+        <w:shd w:fill="F1F4F7" w:color="auto" w:val="clear"/>
+        <w:spacing w:after="0" w:line="252"/>
+        <w:ind w:left="140" w:right="60"/>
+      </w:pPr>
+      <w:r>
+        <w:rPr>
+          <w:rFonts w:ascii="Consolas" w:cs="Consolas" w:eastAsia="Consolas" w:hAnsi="Consolas"/>
+          <w:color w:val="1B2733"/>
+          <w:sz w:val="17"/>
+          <w:szCs w:val="17"/>
+        </w:rPr>
+        <w:t xml:space="preserve">echo "gary 建立 orders-kek(200 = 新建,409 = 已存在):"; hc -u gary:gary-pw -X POST -H "$J" -d '{"name":"orders-kek","kmsType":"local-kms","kmsKeyId":"demo-local-key","shared":false,"doc":"CSFLE demo (local-kms)"}' https://schema-registry:8081/dek-registry/v1/keks | tail -1</w:t>
+      </w:r>
+    </w:p>
+    <w:p>
+      <w:pPr>
+        <w:pBdr>
+          <w:top w:val="none" w:color="FFFFFF" w:sz="0"/>
+          <w:left w:val="single" w:color="1F7A8C" w:sz="18" w:space="6"/>
+          <w:bottom w:val="none" w:color="FFFFFF" w:sz="0"/>
+          <w:right w:val="none" w:color="FFFFFF" w:sz="0"/>
+        </w:pBdr>
+        <w:shd w:fill="F1F4F7" w:color="auto" w:val="clear"/>
+        <w:spacing w:after="0" w:line="252"/>
+        <w:ind w:left="140" w:right="60"/>
+      </w:pPr>
+      <w:r>
+        <w:rPr>
+          <w:rFonts w:ascii="Consolas" w:cs="Consolas" w:eastAsia="Consolas" w:hAnsi="Consolas"/>
+          <w:color w:val="1B2733"/>
+          <w:sz w:val="17"/>
+          <w:szCs w:val="17"/>
+        </w:rPr>
+        <w:t xml:space="preserve">echo "yujie 建立 x-kek:"; hc -u yujie:yujie-pw -X POST -H "$J" -d '{"name":"x-kek","kmsType":"local-kms","kmsKeyId":"k","shared":false}' https://schema-registry:8081/dek-registry/v1/keks</w:t>
+      </w:r>
+    </w:p>
+    <w:p>
+      <w:pPr>
+        <w:pBdr>
+          <w:top w:val="none" w:color="FFFFFF" w:sz="0"/>
+          <w:left w:val="single" w:color="1F7A8C" w:sz="18" w:space="6"/>
+          <w:bottom w:val="none" w:color="FFFFFF" w:sz="0"/>
+          <w:right w:val="none" w:color="FFFFFF" w:sz="0"/>
+        </w:pBdr>
+        <w:shd w:fill="F1F4F7" w:color="auto" w:val="clear"/>
+        <w:spacing w:after="0" w:line="252"/>
+        <w:ind w:left="140" w:right="60"/>
+      </w:pPr>
+      <w:r>
+        <w:rPr>
+          <w:rFonts w:ascii="Consolas" w:cs="Consolas" w:eastAsia="Consolas" w:hAnsi="Consolas"/>
+          <w:color w:val="1B2733"/>
+          <w:sz w:val="17"/>
+          <w:szCs w:val="17"/>
+        </w:rPr>
+        <w:t xml:space="preserve">echo "yujie 讀 orders-kek:"; hc -u yujie:yujie-pw https://schema-registry:8081/dek-registry/v1/keks/orders-kek</w:t>
+      </w:r>
+    </w:p>
+    <w:p>
+      <w:pPr>
+        <w:pBdr>
+          <w:top w:val="none" w:color="FFFFFF" w:sz="0"/>
+          <w:left w:val="single" w:color="1F7A8C" w:sz="18" w:space="6"/>
+          <w:bottom w:val="none" w:color="FFFFFF" w:sz="0"/>
+          <w:right w:val="none" w:color="FFFFFF" w:sz="0"/>
+        </w:pBdr>
+        <w:shd w:fill="F1F4F7" w:color="auto" w:val="clear"/>
+        <w:spacing w:after="0" w:line="252"/>
+        <w:ind w:left="140" w:right="60"/>
+      </w:pPr>
+      <w:r>
+        <w:rPr>
+          <w:rFonts w:ascii="Consolas" w:cs="Consolas" w:eastAsia="Consolas" w:hAnsi="Consolas"/>
+          <w:color w:val="1B2733"/>
+          <w:sz w:val="17"/>
+          <w:szCs w:val="17"/>
+        </w:rPr>
+        <w:t xml:space="preserve">echo "ming 讀 orders-kek:"; hc -u ming:ming-pw https://schema-registry:8081/dek-registry/v1/keks/orders-kek</w:t>
+      </w:r>
+    </w:p>
+    <w:p>
+      <w:pPr>
+        <w:spacing w:after="80"/>
+      </w:pPr>
+    </w:p>
+    <w:p>
+      <w:pPr>
+        <w:spacing w:after="100" w:line="300"/>
+      </w:pPr>
+      <w:r>
+        <w:rPr>
+          <w:rFonts w:ascii="Microsoft JhengHei" w:cs="Microsoft JhengHei" w:eastAsia="Microsoft JhengHei" w:hAnsi="Microsoft JhengHei"/>
+          <w:b/>
+          <w:bCs/>
+          <w:color w:val="B7791F"/>
+          <w:sz w:val="21"/>
+          <w:szCs w:val="21"/>
+        </w:rPr>
+        <w:t xml:space="preserve">預期:</w:t>
+      </w:r>
+      <w:r>
+        <w:rPr>
+          <w:rFonts w:ascii="Microsoft JhengHei" w:cs="Microsoft JhengHei" w:eastAsia="Microsoft JhengHei" w:hAnsi="Microsoft JhengHei"/>
+          <w:sz w:val="21"/>
+          <w:szCs w:val="21"/>
+        </w:rPr>
+        <w:t xml:space="preserve">yujie 建 x-kek:User is denied operation Register on Kek,403;yujie 讀 orders-kek:回 KEK 內容 200;ming 讀:User is denied operation Read on Kek,403。</w:t>
+      </w:r>
+    </w:p>
+    <w:tbl>
+      <w:tblPr>
+        <w:tblW w:type="dxa" w:w="9026"/>
+        <w:tblBorders>
+          <w:top w:val="single" w:color="auto" w:sz="4"/>
+          <w:left w:val="single" w:color="auto" w:sz="4"/>
+          <w:bottom w:val="single" w:color="auto" w:sz="4"/>
+          <w:right w:val="single" w:color="auto" w:sz="4"/>
+          <w:insideH w:val="single" w:color="auto" w:sz="4"/>
+          <w:insideV w:val="single" w:color="auto" w:sz="4"/>
+        </w:tblBorders>
+      </w:tblPr>
+      <w:tblGrid>
+        <w:gridCol w:w="9026"/>
+      </w:tblGrid>
+      <w:tr>
+        <w:tc>
+          <w:tcPr>
+            <w:tcW w:type="dxa" w:w="9026"/>
+            <w:tcBorders>
+              <w:top w:val="single" w:color="D5DEE6" w:sz="4"/>
+              <w:left w:val="single" w:color="B03A2E" w:sz="24"/>
+              <w:bottom w:val="single" w:color="D5DEE6" w:sz="4"/>
+              <w:right w:val="single" w:color="D5DEE6" w:sz="4"/>
+            </w:tcBorders>
+            <w:shd w:fill="FDECEA" w:color="auto" w:val="clear"/>
+            <w:tcMar>
+              <w:top w:type="dxa" w:w="80"/>
+              <w:left w:type="dxa" w:w="140"/>
+              <w:bottom w:type="dxa" w:w="80"/>
+              <w:right w:type="dxa" w:w="140"/>
+            </w:tcMar>
+          </w:tcPr>
+          <w:p>
+            <w:pPr>
+              <w:spacing w:after="0" w:line="288"/>
+            </w:pPr>
+            <w:r>
+              <w:rPr>
+                <w:rFonts w:ascii="Microsoft JhengHei" w:cs="Microsoft JhengHei" w:eastAsia="Microsoft JhengHei" w:hAnsi="Microsoft JhengHei"/>
+                <w:b/>
+                <w:bCs/>
+                <w:color w:val="B03A2E"/>
+                <w:sz w:val="20"/>
+                <w:szCs w:val="20"/>
+              </w:rPr>
+              <w:t xml:space="preserve">注意:</w:t>
+            </w:r>
+            <w:r>
+              <w:rPr>
+                <w:rFonts w:ascii="Microsoft JhengHei" w:cs="Microsoft JhengHei" w:eastAsia="Microsoft JhengHei" w:hAnsi="Microsoft JhengHei"/>
+                <w:sz w:val="20"/>
+                <w:szCs w:val="20"/>
+              </w:rPr>
+              <w:t xml:space="preserve">金鑰的「解密能力」不由 RBAC 控制:官方文件寫明,能不能解開 DEK 取決於 KMS(雲端 KMS 的 IAM、Vault 的 token 等),不是 Confluent 的 role。RBAC 只管「誰能建、改、讀 KEK 的中繼資料」。本機的 local-kms 把金鑰衍生自一個環境變數(LOCAL_SECRET),任何拿到這個值的 client 都能解密,所以只能拿來測試。</w:t>
+            </w:r>
+          </w:p>
+        </w:tc>
+      </w:tr>
+    </w:tbl>
+    <w:p>
+      <w:pPr>
+        <w:spacing w:after="80"/>
+      </w:pPr>
+    </w:p>
+    <w:p>
+      <w:pPr>
+        <w:pStyle w:val="Heading3"/>
+        <w:keepNext/>
+      </w:pPr>
+      <w:r>
+        <w:rPr>
+          <w:rFonts w:ascii="Microsoft JhengHei" w:cs="Microsoft JhengHei" w:eastAsia="Microsoft JhengHei" w:hAnsi="Microsoft JhengHei"/>
+        </w:rPr>
+        <w:t xml:space="preserve">20.5 欄位級加密(CSFLE):授權限制,這個環境無法驗證加密與解密</w:t>
+      </w:r>
+    </w:p>
+    <w:p>
+      <w:pPr>
+        <w:spacing w:after="100" w:line="300"/>
+      </w:pPr>
+      <w:r>
+        <w:rPr>
+          <w:rFonts w:ascii="Microsoft JhengHei" w:cs="Microsoft JhengHei" w:eastAsia="Microsoft JhengHei" w:hAnsi="Microsoft JhengHei"/>
+          <w:sz w:val="21"/>
+          <w:szCs w:val="21"/>
+        </w:rPr>
+        <w:t xml:space="preserve">同一份 schema 加上 ENCRYPT 規則(PII 標籤的欄位用 orders-kek 加密)去註冊。官方文件的 CSFLE 屬於企業版再加購授權的功能。demo 用的是試用授權,註冊時被拒絕:402「Both enterprise and add-on CSFLE licenses are required」。</w:t>
+      </w:r>
+    </w:p>
+    <w:p>
+      <w:pPr>
+        <w:keepNext/>
+        <w:spacing w:after="60" w:before="120"/>
+      </w:pPr>
+      <w:r>
+        <w:rPr>
+          <w:rFonts w:ascii="Microsoft JhengHei" w:cs="Microsoft JhengHei" w:eastAsia="Microsoft JhengHei" w:hAnsi="Microsoft JhengHei"/>
+          <w:b/>
+          <w:bCs/>
+          <w:color w:val="1F7A8C"/>
+          <w:sz w:val="20"/>
+          <w:szCs w:val="20"/>
+        </w:rPr>
+        <w:t xml:space="preserve">手動指令</w:t>
+      </w:r>
+    </w:p>
+    <w:p>
+      <w:pPr>
+        <w:pBdr>
+          <w:top w:val="none" w:color="FFFFFF" w:sz="0"/>
+          <w:left w:val="single" w:color="1F7A8C" w:sz="18" w:space="6"/>
+          <w:bottom w:val="none" w:color="FFFFFF" w:sz="0"/>
+          <w:right w:val="none" w:color="FFFFFF" w:sz="0"/>
+        </w:pBdr>
+        <w:shd w:fill="F1F4F7" w:color="auto" w:val="clear"/>
+        <w:spacing w:after="0" w:line="252"/>
+        <w:ind w:left="140" w:right="60"/>
+      </w:pPr>
+      <w:r>
+        <w:rPr>
+          <w:rFonts w:ascii="Consolas" w:cs="Consolas" w:eastAsia="Consolas" w:hAnsi="Consolas"/>
+          <w:color w:val="1B2733"/>
+          <w:sz w:val="17"/>
+          <w:szCs w:val="17"/>
+        </w:rPr>
+        <w:t xml:space="preserve">J='Content-Type: application/vnd.schemaregistry.v1+json'</w:t>
+      </w:r>
+    </w:p>
+    <w:p>
+      <w:pPr>
+        <w:pBdr>
+          <w:top w:val="none" w:color="FFFFFF" w:sz="0"/>
+          <w:left w:val="single" w:color="1F7A8C" w:sz="18" w:space="6"/>
+          <w:bottom w:val="none" w:color="FFFFFF" w:sz="0"/>
+          <w:right w:val="none" w:color="FFFFFF" w:sz="0"/>
+        </w:pBdr>
+        <w:shd w:fill="F1F4F7" w:color="auto" w:val="clear"/>
+        <w:spacing w:after="0" w:line="252"/>
+        <w:ind w:left="140" w:right="60"/>
+      </w:pPr>
+      <w:r>
+        <w:rPr>
+          <w:rFonts w:ascii="Consolas" w:cs="Consolas" w:eastAsia="Consolas" w:hAnsi="Consolas"/>
+          <w:color w:val="1B2733"/>
+          <w:sz w:val="17"/>
+          <w:szCs w:val="17"/>
+        </w:rPr>
+        <w:t xml:space="preserve">ORDER_ENC_BODY='{"schemaType":"AVRO","schema":"{\"type\":\"record\",\"name\":\"Order\",\"namespace\":\"demo\",\"fields\":[{\"name\":\"id\",\"type\":\"string\"},{\"name\":\"amount\",\"type\":\"int\"},{\"name\":\"card_no\",\"type\":\"string\",\"confluent:tags\":[\"PII\"]}]}","ruleSet":{"domainRules":[{"name":"encryptPII","kind":"TRANSFORM","type":"ENCRYPT","mode":"WRITEREAD","tags":["PII"],"params":{"encrypt.kek.name":"orders-kek"},"onFailure":"ERROR,ERROR"}]}}'</w:t>
+      </w:r>
+    </w:p>
+    <w:p>
+      <w:pPr>
+        <w:pBdr>
+          <w:top w:val="none" w:color="FFFFFF" w:sz="0"/>
+          <w:left w:val="single" w:color="1F7A8C" w:sz="18" w:space="6"/>
+          <w:bottom w:val="none" w:color="FFFFFF" w:sz="0"/>
+          <w:right w:val="none" w:color="FFFFFF" w:sz="0"/>
+        </w:pBdr>
+        <w:shd w:fill="F1F4F7" w:color="auto" w:val="clear"/>
+        <w:spacing w:after="0" w:line="252"/>
+        <w:ind w:left="140" w:right="60"/>
+      </w:pPr>
+      <w:r>
+        <w:rPr>
+          <w:rFonts w:ascii="Consolas" w:cs="Consolas" w:eastAsia="Consolas" w:hAnsi="Consolas"/>
+          <w:color w:val="1B2733"/>
+          <w:sz w:val="17"/>
+          <w:szCs w:val="17"/>
+        </w:rPr>
+        <w:t xml:space="preserve">hc -u gary:gary-pw -X POST -H "$J" -d "$ORDER_ENC_BODY" https://schema-registry:8081/subjects/orders.events-value/versions</w:t>
+      </w:r>
+    </w:p>
+    <w:p>
+      <w:pPr>
+        <w:spacing w:after="80"/>
+      </w:pPr>
+    </w:p>
+    <w:p>
+      <w:pPr>
+        <w:spacing w:after="100" w:line="300"/>
+      </w:pPr>
+      <w:r>
+        <w:rPr>
+          <w:rFonts w:ascii="Microsoft JhengHei" w:cs="Microsoft JhengHei" w:eastAsia="Microsoft JhengHei" w:hAnsi="Microsoft JhengHei"/>
+          <w:b/>
+          <w:bCs/>
+          <w:color w:val="B7791F"/>
+          <w:sz w:val="21"/>
+          <w:szCs w:val="21"/>
+        </w:rPr>
+        <w:t xml:space="preserve">預期:</w:t>
+      </w:r>
+      <w:r>
+        <w:rPr>
+          <w:rFonts w:ascii="Microsoft JhengHei" w:cs="Microsoft JhengHei" w:eastAsia="Microsoft JhengHei" w:hAnsi="Microsoft JhengHei"/>
+          <w:sz w:val="21"/>
+          <w:szCs w:val="21"/>
+        </w:rPr>
+        <w:t xml:space="preserve">{"error_code":40201,"message":"Both enterprise and add-on CSFLE licenses are required."} [HTTP 402]。</w:t>
+      </w:r>
+    </w:p>
+    <w:tbl>
+      <w:tblPr>
+        <w:tblW w:type="dxa" w:w="9026"/>
+        <w:tblBorders>
+          <w:top w:val="single" w:color="auto" w:sz="4"/>
+          <w:left w:val="single" w:color="auto" w:sz="4"/>
+          <w:bottom w:val="single" w:color="auto" w:sz="4"/>
+          <w:right w:val="single" w:color="auto" w:sz="4"/>
+          <w:insideH w:val="single" w:color="auto" w:sz="4"/>
+          <w:insideV w:val="single" w:color="auto" w:sz="4"/>
+        </w:tblBorders>
+      </w:tblPr>
+      <w:tblGrid>
+        <w:gridCol w:w="9026"/>
+      </w:tblGrid>
+      <w:tr>
+        <w:tc>
+          <w:tcPr>
+            <w:tcW w:type="dxa" w:w="9026"/>
+            <w:tcBorders>
+              <w:top w:val="single" w:color="D5DEE6" w:sz="4"/>
+              <w:left w:val="single" w:color="B03A2E" w:sz="24"/>
+              <w:bottom w:val="single" w:color="D5DEE6" w:sz="4"/>
+              <w:right w:val="single" w:color="D5DEE6" w:sz="4"/>
+            </w:tcBorders>
+            <w:shd w:fill="FDECEA" w:color="auto" w:val="clear"/>
+            <w:tcMar>
+              <w:top w:type="dxa" w:w="80"/>
+              <w:left w:type="dxa" w:w="140"/>
+              <w:bottom w:type="dxa" w:w="80"/>
+              <w:right w:type="dxa" w:w="140"/>
+            </w:tcMar>
+          </w:tcPr>
+          <w:p>
+            <w:pPr>
+              <w:spacing w:after="0" w:line="288"/>
+            </w:pPr>
+            <w:r>
+              <w:rPr>
+                <w:rFonts w:ascii="Microsoft JhengHei" w:cs="Microsoft JhengHei" w:eastAsia="Microsoft JhengHei" w:hAnsi="Microsoft JhengHei"/>
+                <w:b/>
+                <w:bCs/>
+                <w:color w:val="B03A2E"/>
+                <w:sz w:val="20"/>
+                <w:szCs w:val="20"/>
+              </w:rPr>
+              <w:t xml:space="preserve">注意:</w:t>
+            </w:r>
+            <w:r>
+              <w:rPr>
+                <w:rFonts w:ascii="Microsoft JhengHei" w:cs="Microsoft JhengHei" w:eastAsia="Microsoft JhengHei" w:hAnsi="Microsoft JhengHei"/>
+                <w:sz w:val="20"/>
+                <w:szCs w:val="20"/>
+              </w:rPr>
+              <w:t xml:space="preserve">三個重點:① 沒有驗證:ENCRYPT 規則的實際加密、解密、金鑰輪替、效能,以及 KMS 對接(AWS / Azure / GCP / HashiCorp Vault 是官方支援的型態;沒有看到 CyberArk Conjur 或其他地端 KMS 的內建型態,地端要用自訂 KMS driver 或 Vault),都要在有授權的環境另外驗。② 要評估授權:企業版之外的加購授權,屬商務問題,不是技術設定。③ 危險的靜默失敗(測試時觀察到):如果 Schema Registry 沒有開 RuleSet extension,註冊帶規則的 schema 不會報錯,而是默默丟掉規則;之後 producer 照常寫入,卡號以明文落在 topic 裡(用一般 console consumer 讀原始位元組就看得到)。所以上線前一定要用「讀原始位元組」的方式確認欄位真的是密文,不能只看 producer 沒報錯。</w:t>
+            </w:r>
+          </w:p>
+        </w:tc>
+      </w:tr>
+    </w:tbl>
+    <w:p>
+      <w:pPr>
+        <w:spacing w:after="80"/>
+      </w:pPr>
+    </w:p>
+    <w:tbl>
+      <w:tblPr>
+        <w:tblW w:type="dxa" w:w="9026"/>
+        <w:tblBorders>
+          <w:top w:val="single" w:color="auto" w:sz="4"/>
+          <w:left w:val="single" w:color="auto" w:sz="4"/>
+          <w:bottom w:val="single" w:color="auto" w:sz="4"/>
+          <w:right w:val="single" w:color="auto" w:sz="4"/>
+          <w:insideH w:val="single" w:color="auto" w:sz="4"/>
+          <w:insideV w:val="single" w:color="auto" w:sz="4"/>
+        </w:tblBorders>
+      </w:tblPr>
+      <w:tblGrid>
+        <w:gridCol w:w="9026"/>
+      </w:tblGrid>
+      <w:tr>
+        <w:tc>
+          <w:tcPr>
+            <w:tcW w:type="dxa" w:w="9026"/>
+            <w:tcBorders>
+              <w:top w:val="single" w:color="DDD3EC" w:sz="4"/>
+              <w:left w:val="single" w:color="6B4FA0" w:sz="30"/>
+              <w:bottom w:val="single" w:color="DDD3EC" w:sz="4"/>
+              <w:right w:val="single" w:color="DDD3EC" w:sz="4"/>
+            </w:tcBorders>
+            <w:shd w:fill="EEF6F1" w:color="auto" w:val="clear"/>
+            <w:tcMar>
+              <w:top w:type="dxa" w:w="100"/>
+              <w:left w:type="dxa" w:w="180"/>
+              <w:bottom w:type="dxa" w:w="100"/>
+              <w:right w:type="dxa" w:w="180"/>
+            </w:tcMar>
+          </w:tcPr>
+          <w:p>
+            <w:pPr>
+              <w:spacing w:after="60"/>
+            </w:pPr>
+            <w:r>
+              <w:rPr>
+                <w:rFonts w:ascii="Microsoft JhengHei" w:cs="Microsoft JhengHei" w:eastAsia="Microsoft JhengHei" w:hAnsi="Microsoft JhengHei"/>
+                <w:b/>
+                <w:bCs/>
+                <w:color w:val="6B4FA0"/>
+                <w:sz w:val="19"/>
+                <w:szCs w:val="19"/>
+              </w:rPr>
+              <w:t xml:space="preserve">小結:Ming 學到了什麼</w:t>
+            </w:r>
+          </w:p>
+          <w:p>
+            <w:pPr>
+              <w:spacing w:after="70" w:line="312"/>
+            </w:pPr>
+            <w:r>
+              <w:rPr>
+                <w:rFonts w:ascii="Microsoft JhengHei" w:cs="Microsoft JhengHei" w:eastAsia="Microsoft JhengHei" w:hAnsi="Microsoft JhengHei"/>
+                <w:color w:val="2B2540"/>
+                <w:sz w:val="21"/>
+                <w:szCs w:val="21"/>
+              </w:rPr>
+              <w:t xml:space="preserve">• Schema Registry 不另設帳號:認證交 MDS,授權看 subject 與 Kek:&lt;名稱&gt; 的 role。</w:t>
+            </w:r>
+          </w:p>
+          <w:p>
+            <w:pPr>
+              <w:spacing w:after="70" w:line="312"/>
+            </w:pPr>
+            <w:r>
+              <w:rPr>
+                <w:rFonts w:ascii="Microsoft JhengHei" w:cs="Microsoft JhengHei" w:eastAsia="Microsoft JhengHei" w:hAnsi="Microsoft JhengHei"/>
+                <w:color w:val="2B2540"/>
+                <w:sz w:val="21"/>
+                <w:szCs w:val="21"/>
+              </w:rPr>
+              <w:t xml:space="preserve">• KEK 的解密能力由 KMS 控制,不是 RBAC;local-kms 只能測試。</w:t>
+            </w:r>
+          </w:p>
+          <w:p>
+            <w:pPr>
+              <w:spacing w:after="70" w:line="312"/>
+            </w:pPr>
+            <w:r>
+              <w:rPr>
+                <w:rFonts w:ascii="Microsoft JhengHei" w:cs="Microsoft JhengHei" w:eastAsia="Microsoft JhengHei" w:hAnsi="Microsoft JhengHei"/>
+                <w:color w:val="2B2540"/>
+                <w:sz w:val="21"/>
+                <w:szCs w:val="21"/>
+              </w:rPr>
+              <w:t xml:space="preserve">• 欄位級加密需要企業版加 CSFLE 加購授權;這個環境沒有驗證加密與解密。</w:t>
+            </w:r>
+          </w:p>
+          <w:p>
+            <w:pPr>
+              <w:spacing w:after="70" w:line="312"/>
+            </w:pPr>
+            <w:r>
+              <w:rPr>
+                <w:rFonts w:ascii="Microsoft JhengHei" w:cs="Microsoft JhengHei" w:eastAsia="Microsoft JhengHei" w:hAnsi="Microsoft JhengHei"/>
+                <w:color w:val="2B2540"/>
+                <w:sz w:val="21"/>
+                <w:szCs w:val="21"/>
+              </w:rPr>
+              <w:t xml:space="preserve">• 上線前要用讀原始位元組的方式確認欄位是密文——規則被丟掉時不會有任何錯誤。</w:t>
+            </w:r>
+          </w:p>
+        </w:tc>
+      </w:tr>
+    </w:tbl>
+    <w:p>
+      <w:pPr>
+        <w:spacing w:after="100"/>
+      </w:pPr>
+    </w:p>
+    <w:p>
+      <w:pPr>
         <w:pStyle w:val="Heading1"/>
         <w:pageBreakBefore/>
       </w:pPr>
@@ -47043,7 +48978,7 @@
                 <w:sz w:val="18"/>
                 <w:szCs w:val="18"/>
               </w:rPr>
-              <w:t xml:space="preserve">帳號被偷之後(Lab 19)</w:t>
+              <w:t xml:space="preserve">Schema Registry 與欄位級加密(Lab 20)</w:t>
             </w:r>
           </w:p>
         </w:tc>
@@ -47077,7 +49012,7 @@
                 <w:sz w:val="18"/>
                 <w:szCs w:val="18"/>
               </w:rPr>
-              <w:t xml:space="preserve">demo 已做:60 秒重新認證、認證失敗告警、TLS 套件限定、連線數上限、client quota、AD 鎖定雙面刃;未驗證:真實 AD 的鎖定原則與 F5 的登入速率限制、各元件(REST Proxy、C3)的 TLS 套件限定、重新認證間隔對大量 client 的負載。</w:t>
+              <w:t xml:space="preserve">已做:SR 的 RBAC、subject 與 KEK 授權;未驗證:CSFLE 的加密與解密(需企業版加 CSFLE 加購授權)、地端 KMS 對接(文件列的型態是 AWS / Azure / GCP / Vault)、machine 身分如何向 SR 認證(SR 的 REST 只認 AD 帳密或 MDS token)。</w:t>
             </w:r>
           </w:p>
         </w:tc>
@@ -47117,7 +49052,7 @@
                 <w:sz w:val="18"/>
                 <w:szCs w:val="18"/>
               </w:rPr>
-              <w:t xml:space="preserve">傳輸加密的剩餘題目</w:t>
+              <w:t xml:space="preserve">帳號被偷之後(Lab 19)</w:t>
             </w:r>
           </w:p>
         </w:tc>
@@ -47151,7 +49086,7 @@
                 <w:sz w:val="18"/>
                 <w:szCs w:val="18"/>
               </w:rPr>
-              <w:t xml:space="preserve">demo 已做 LDAPS、監控 HTTPS + Basic、C3 HTTPS(Lab 17);未驗證:真實 AD 的 LDAPS 憑證鏈(中繼 CA 要放進信任庫)、Alertmanager 的 mTLS、由 F5 終止 C3 的 TLS 時的行為。</w:t>
+              <w:t xml:space="preserve">demo 已做:60 秒重新認證、認證失敗告警、TLS 套件限定、連線數上限、client quota、AD 鎖定雙面刃;未驗證:真實 AD 的鎖定原則與 F5 的登入速率限制、各元件(REST Proxy、C3)的 TLS 套件限定、重新認證間隔對大量 client 的負載。</w:t>
             </w:r>
           </w:p>
         </w:tc>
@@ -47191,7 +49126,7 @@
                 <w:sz w:val="18"/>
                 <w:szCs w:val="18"/>
               </w:rPr>
-              <w:t xml:space="preserve">負載平衡器</w:t>
+              <w:t xml:space="preserve">傳輸加密的剩餘題目</w:t>
             </w:r>
           </w:p>
         </w:tc>
@@ -47225,7 +49160,7 @@
                 <w:sz w:val="18"/>
                 <w:szCs w:val="18"/>
               </w:rPr>
-              <w:t xml:space="preserve">客戶使用 F5:legacy app 前面的 LB 必須是 L4 透傳;sticky session 與 F5 的 TLS session 行為待客戶確認。</w:t>
+              <w:t xml:space="preserve">demo 已做 LDAPS、監控 HTTPS + Basic、C3 HTTPS(Lab 17);未驗證:真實 AD 的 LDAPS 憑證鏈(中繼 CA 要放進信任庫)、Alertmanager 的 mTLS、由 F5 終止 C3 的 TLS 時的行為。</w:t>
             </w:r>
           </w:p>
         </w:tc>
@@ -47265,7 +49200,7 @@
                 <w:sz w:val="18"/>
                 <w:szCs w:val="18"/>
               </w:rPr>
-              <w:t xml:space="preserve">憑證設計</w:t>
+              <w:t xml:space="preserve">負載平衡器</w:t>
             </w:r>
           </w:p>
         </w:tc>
@@ -47299,7 +49234,7 @@
                 <w:sz w:val="18"/>
                 <w:szCs w:val="18"/>
               </w:rPr>
-              <w:t xml:space="preserve">以客戶前提為準:共用一張 server 憑證,只做傳輸加密;身分另外處理(平台元件與 legacy app 各用 client 憑證)。Kafka 專家建議每台一張,僅供參考,不採用。</w:t>
+              <w:t xml:space="preserve">客戶使用 F5:legacy app 前面的 LB 必須是 L4 透傳;sticky session 與 F5 的 TLS session 行為待客戶確認。</w:t>
             </w:r>
           </w:p>
         </w:tc>
@@ -47339,7 +49274,7 @@
                 <w:sz w:val="18"/>
                 <w:szCs w:val="18"/>
               </w:rPr>
-              <w:t xml:space="preserve">變更核准</w:t>
+              <w:t xml:space="preserve">憑證設計</w:t>
             </w:r>
           </w:p>
         </w:tc>
@@ -47373,7 +49308,7 @@
                 <w:sz w:val="18"/>
                 <w:szCs w:val="18"/>
               </w:rPr>
-              <w:t xml:space="preserve">OP menu 的 ticket 檢查是可開關、可抽換的,等客戶決定核准方式。</w:t>
+              <w:t xml:space="preserve">以客戶前提為準:共用一張 server 憑證,只做傳輸加密;身分另外處理(平台元件與 legacy app 各用 client 憑證)。Kafka 專家建議每台一張,僅供參考,不採用。</w:t>
             </w:r>
           </w:p>
         </w:tc>
@@ -47413,7 +49348,7 @@
                 <w:sz w:val="18"/>
                 <w:szCs w:val="18"/>
               </w:rPr>
-              <w:t xml:space="preserve">CyberArk 的 PAM 側</w:t>
+              <w:t xml:space="preserve">變更核准</w:t>
             </w:r>
           </w:p>
         </w:tc>
@@ -47427,6 +49362,80 @@
               <w:right w:val="single" w:color="C9D3DC" w:sz="4"/>
             </w:tcBorders>
             <w:shd w:fill="F1F5F8" w:color="auto" w:val="clear"/>
+            <w:tcMar>
+              <w:top w:type="dxa" w:w="60"/>
+              <w:left w:type="dxa" w:w="100"/>
+              <w:bottom w:type="dxa" w:w="60"/>
+              <w:right w:type="dxa" w:w="100"/>
+            </w:tcMar>
+          </w:tcPr>
+          <w:p>
+            <w:pPr>
+              <w:spacing w:after="0" w:line="276"/>
+            </w:pPr>
+            <w:r>
+              <w:rPr>
+                <w:rFonts w:ascii="Microsoft JhengHei" w:cs="Microsoft JhengHei" w:eastAsia="Microsoft JhengHei" w:hAnsi="Microsoft JhengHei"/>
+                <w:b w:val="false"/>
+                <w:bCs w:val="false"/>
+                <w:color w:val="22313F"/>
+                <w:sz w:val="18"/>
+                <w:szCs w:val="18"/>
+              </w:rPr>
+              <w:t xml:space="preserve">OP menu 的 ticket 檢查是可開關、可抽換的,等客戶決定核准方式。</w:t>
+            </w:r>
+          </w:p>
+        </w:tc>
+      </w:tr>
+      <w:tr>
+        <w:trPr>
+          <w:cantSplit/>
+          <w:tblHeader w:val="off"/>
+        </w:trPr>
+        <w:tc>
+          <w:tcPr>
+            <w:tcW w:type="dxa" w:w="2600"/>
+            <w:tcBorders>
+              <w:top w:val="single" w:color="C9D3DC" w:sz="4"/>
+              <w:left w:val="single" w:color="C9D3DC" w:sz="4"/>
+              <w:bottom w:val="single" w:color="C9D3DC" w:sz="4"/>
+              <w:right w:val="single" w:color="C9D3DC" w:sz="4"/>
+            </w:tcBorders>
+            <w:shd w:fill="FFFFFF" w:color="auto" w:val="clear"/>
+            <w:tcMar>
+              <w:top w:type="dxa" w:w="60"/>
+              <w:left w:type="dxa" w:w="100"/>
+              <w:bottom w:type="dxa" w:w="60"/>
+              <w:right w:type="dxa" w:w="100"/>
+            </w:tcMar>
+          </w:tcPr>
+          <w:p>
+            <w:pPr>
+              <w:spacing w:after="0" w:line="276"/>
+            </w:pPr>
+            <w:r>
+              <w:rPr>
+                <w:rFonts w:ascii="Microsoft JhengHei" w:cs="Microsoft JhengHei" w:eastAsia="Microsoft JhengHei" w:hAnsi="Microsoft JhengHei"/>
+                <w:b w:val="false"/>
+                <w:bCs w:val="false"/>
+                <w:color w:val="22313F"/>
+                <w:sz w:val="18"/>
+                <w:szCs w:val="18"/>
+              </w:rPr>
+              <w:t xml:space="preserve">CyberArk 的 PAM 側</w:t>
+            </w:r>
+          </w:p>
+        </w:tc>
+        <w:tc>
+          <w:tcPr>
+            <w:tcW w:type="dxa" w:w="6426"/>
+            <w:tcBorders>
+              <w:top w:val="single" w:color="C9D3DC" w:sz="4"/>
+              <w:left w:val="single" w:color="C9D3DC" w:sz="4"/>
+              <w:bottom w:val="single" w:color="C9D3DC" w:sz="4"/>
+              <w:right w:val="single" w:color="C9D3DC" w:sz="4"/>
+            </w:tcBorders>
+            <w:shd w:fill="FFFFFF" w:color="auto" w:val="clear"/>
             <w:tcMar>
               <w:top w:type="dxa" w:w="60"/>
               <w:left w:type="dxa" w:w="100"/>

</xml_diff>

<commit_message>
內部通道改 mTLS(共用憑證 CN=kafka-internal);Lab 9.5-9.6 改寫、Lab 19.9(KAFKA-20774)、Lab 20.6(讀原始位元組);手冊 v2 重產
- INTERNAL(9092)與 CONTROLLER(9093)共用一張 client/server 憑證做 mTLS,super.users 加 User:kafka-internal;代價:audit 分不出哪台、私鑰等同 super user
- 驗證:從零重建 preflight 18/18;第 1-20 章 0 失敗(第 19、20 章新步驟調整後重跑 0 失敗),第 15、16 章 0 失敗,直接重啟兩台 broker 正常,SCRAM 登入成功,heal 用到 0 次;verify-doc 第 9、19、20 章 0 不符合
- 修正:sr-raw-check 改用 svc-orders(SCRAM)寫入,不受前面章節 role 變動影響;scram-delete-bug 在跑過很多章節的環境可能不重現(全新叢集才 100% 重現),腳本與 Lab 兩種結果都明講

Co-Authored-By: Claude Sonnet 5.5 <noreply@anthropic.com>
</commit_message>
<xml_diff>
--- a/Confluent-Security-Lab-Story-Guide-v2-精簡版.docx
+++ b/Confluent-Security-Lab-Story-Guide-v2-精簡版.docx
@@ -3925,7 +3925,7 @@
                 <w:sz w:val="17"/>
                 <w:szCs w:val="17"/>
               </w:rPr>
-              <w:t xml:space="preserve">SASL/PLAIN 靜態帳號(kafka-controller)</w:t>
+              <w:t xml:space="preserve">mTLS(與 broker 共用憑證 CN=kafka-internal)</w:t>
             </w:r>
           </w:p>
         </w:tc>
@@ -4033,7 +4033,7 @@
                 <w:sz w:val="17"/>
                 <w:szCs w:val="17"/>
               </w:rPr>
-              <w:t xml:space="preserve">CLIENT:人 PLAIN+AD、服務 SCRAM、元件 OAUTHBEARER;INTERNAL 9092 只在容器內</w:t>
+              <w:t xml:space="preserve">CLIENT:人 PLAIN+AD、服務 SCRAM、元件 OAUTHBEARER;INTERNAL 9092(mTLS,共用內部憑證)只在容器內</w:t>
             </w:r>
           </w:p>
         </w:tc>
@@ -9413,7 +9413,7 @@
           <w:sz w:val="21"/>
           <w:szCs w:val="21"/>
         </w:rPr>
-        <w:t xml:space="preserve">KRaft 內部通道:CONTROLLER 用 SASL/PLAIN;broker↔broker 用 SCRAM;INTERNAL/CONTROLLER 埠必須以防火牆限制。</w:t>
+        <w:t xml:space="preserve">KRaft 內部通道:CONTROLLER 與 INTERNAL 都是 mTLS,broker 與 controller 共用一張憑證(CN=kafka-internal);不用 SCRAM(刪除過 SCRAM 憑證後重啟 broker 會失敗,Lab 19);INTERNAL/CONTROLLER 埠必須以防火牆限制。</w:t>
       </w:r>
     </w:p>
     <w:p>
@@ -9551,7 +9551,7 @@
           <w:sz w:val="21"/>
           <w:szCs w:val="21"/>
         </w:rPr>
-        <w:t xml:space="preserve">驗證方式:本手冊的每一條「手動指令」2026-10-09 驗證:從零重建後,第 1 到 20 章整章腳本 0 失敗,第 15、16 章另跑 0 失敗,整條鏈跑完後直接重啟兩台 broker 都正常;第 6、9、18、19、20 章共 48 步的手動指令這次重新實跑並判定,0 不符合,手冊顯示的輸出就是該步指令實跑的結果(labguide/manual-out/);其餘章節的手動指令為上一輪(2026-10-08)實跑 0 不符合的結果,本次未逐步重跑。第 20 章的欄位級加密(CSFLE)需要企業版加購授權,加密與解密在這個環境未驗證。停用 SCRAM 帳號一律覆寫成隨機密碼、不刪除(刪除會讓之後重啟 broker 失敗,見 Lab 19 與 RUNBOOK)。有介面操作的步驟以等效 API/CLI 驗證,截圖來自 Playwright 自動化。</w:t>
+        <w:t xml:space="preserve">驗證方式:本手冊的每一條「手動指令」2026-10-09 驗證(內部通道改 mTLS 後):從零重建,preflight 18 項全過;第 1 到 20 章整章腳本 0 失敗(第 19、20 章新增步驟調整後重跑 0 失敗),第 15、16 章另跑 0 失敗,整條鏈跑完後直接重啟兩台 broker 都正常、SCRAM 登入成功、自癒腳本用到 0 次;第 9、19、20 章共 29 步的手動指令這次重新實跑並判定,0 不符合;第 6、18 章與其餘章節的手動指令為上一輪實跑 0 不符合的結果,本次未逐步重跑。第 20 章的欄位級加密(CSFLE)需要企業版加購授權,加密與解密在這個環境未驗證。停用 SCRAM 帳號一律覆寫成隨機密碼、不刪除;刪除會讓之後重啟 broker 失敗或讓 SCRAM 登入全壞(KAFKA-20774,全新叢集可重現,跑過很多章節的環境不一定重現,見 Lab 19.9 與 RUNBOOK)。有介面操作的步驟以等效 API/CLI 驗證,截圖來自 Playwright 自動化。</w:t>
       </w:r>
     </w:p>
     <w:p>
@@ -44441,7 +44441,7 @@
       <w:r>
         <w:drawing>
           <wp:inline distT="0" distB="0" distL="0" distR="0">
-            <wp:extent cx="5619750" cy="1790700"/>
+            <wp:extent cx="5619750" cy="2047875"/>
             <wp:effectExtent t="0" r="0" b="0" l="0"/>
             <wp:docPr id="20" name="labmap-19.png" descr="Lab 19 地圖:這堂要證明的事、動到的元件(打亮)、走的路與結果(✔ 允許 / ✘ 拒絕)" title="Lab 19 地圖:這堂要證明的事、動到的元件(打亮)、走的路與結果(✔ 允許 / ✘ 拒絕)"/>
             <wp:cNvGraphicFramePr>
@@ -44466,7 +44466,7 @@
                   <pic:spPr bwMode="auto">
                     <a:xfrm>
                       <a:off x="0" y="0"/>
-                      <a:ext cx="5619750" cy="1790700"/>
+                      <a:ext cx="5619750" cy="2047875"/>
                     </a:xfrm>
                     <a:prstGeom prst="rect">
                       <a:avLst/>
@@ -45400,7 +45400,7 @@
                 <w:sz w:val="20"/>
                 <w:szCs w:val="20"/>
               </w:rPr>
-              <w:t xml:space="preserve">為什麼「停用」是覆寫成隨機密碼、不是刪除憑證:實測(CP 8.3.2、KRaft)刪除 SCRAM 憑證之後,下一次重啟 broker 會失敗(broker 啟動時向自己做 SCRAM 認證被拒);全新叢集可 100% 重現,改成覆寫隨機密碼就正常。已經刪過的帳號,事後重新建立即可救回。正式環境在確認 Confluent 的說法前,不要用 --delete-config 刪 SCRAM 憑證(RUNBOOK 第 19 章有重現步驟與對照表)。 重新認證只擋「憑證」。這是第二道防線:要立刻切斷,仍然是解除角色(第 18 章的隔離流程);重新認證確保即使忘了,最慢也在設定的間隔內失效。</w:t>
+              <w:t xml:space="preserve">為什麼「停用」是覆寫成隨機密碼、不是刪除憑證:實測(CP 8.3.2、KRaft)刪除 SCRAM 憑證之後,下一次重啟 broker 會失敗(broker 啟動時向自己做 SCRAM 認證被拒);全新叢集可 100% 重現,改成覆寫隨機密碼就正常。已經刪過的帳號,事後重新建立再重啟 broker 即可救回。內部通道改成 mTLS(Lab 9.5)後 broker 不會再起不來,但重啟後 CLIENT 埠的 SCRAM 帳號會全部登入失敗(實測),所以這條規則仍然必要。這是 Apache Kafka 的已知 bug KAFKA-20774(ScramDelta.apply() 在 REMOVE 對象不存在時丟掉整組 SCRAM 使用者;修復版 4.5.0 尚未發行,CP 8.3.2 的 Kafka 4.3.x 受影響)。在升到含修復的版本之前,不要用 --delete-config 刪 SCRAM 憑證(RUNBOOK 第 19 章有重現步驟、對照表與 bug 連結)。 重新認證只擋「憑證」。這是第二道防線:要立刻切斷,仍然是解除角色(第 18 章的隔離流程);重新認證確保即使忘了,最慢也在設定的間隔內失效。</w:t>
             </w:r>
           </w:p>
         </w:tc>
@@ -46668,6 +46668,99 @@
         <w:t xml:space="preserve">已解鎖;GARY 用對的密碼 [HTTP 200];鎖定已關閉;GARY 未鎖定。</w:t>
       </w:r>
     </w:p>
+    <w:p>
+      <w:pPr>
+        <w:pStyle w:val="Heading3"/>
+        <w:keepNext/>
+      </w:pPr>
+      <w:r>
+        <w:rPr>
+          <w:rFonts w:ascii="Microsoft JhengHei" w:cs="Microsoft JhengHei" w:eastAsia="Microsoft JhengHei" w:hAnsi="Microsoft JhengHei"/>
+        </w:rPr>
+        <w:t xml:space="preserve">19.9 已知 bug:刪除 SCRAM 帳號後重啟 broker,所有 SCRAM 登入失敗(KAFKA-20774)</w:t>
+      </w:r>
+    </w:p>
+    <w:p>
+      <w:pPr>
+        <w:spacing w:after="100" w:line="300"/>
+      </w:pPr>
+      <w:r>
+        <w:rPr>
+          <w:rFonts w:ascii="Microsoft JhengHei" w:cs="Microsoft JhengHei" w:eastAsia="Microsoft JhengHei" w:hAnsi="Microsoft JhengHei"/>
+          <w:sz w:val="21"/>
+          <w:szCs w:val="21"/>
+        </w:rPr>
+        <w:t xml:space="preserve">這就是為什麼整本手冊「停用帳號」都是覆寫隨機密碼、不用 --delete-config。Apache Kafka 的 ScramDelta.apply() 在重放 metadata 時,遇到對象不在目前 image 裡的 REMOVE 紀錄,會把整個 SCRAM 機制的使用者表丟掉(連 kafka-broker 這種應該存在的帳號也消失);修復在 Kafka 4.5.0,尚未發行,CP 8.3.2 的 Kafka 4.3.x 受影響。實驗:新建一個帳號再刪掉,重啟 broker1,svc-orders 用 SCRAM 登入 broker1 失敗(沒重啟的 broker2 正常);把被刪的帳號重新建立,再重啟 broker1,恢復。內部通道已改 mTLS(Lab 9.5),所以 broker 本身起得來;改之前 broker 會直接起不來。</w:t>
+      </w:r>
+    </w:p>
+    <w:p>
+      <w:pPr>
+        <w:keepNext/>
+        <w:spacing w:after="60" w:before="120"/>
+      </w:pPr>
+      <w:r>
+        <w:rPr>
+          <w:rFonts w:ascii="Microsoft JhengHei" w:cs="Microsoft JhengHei" w:eastAsia="Microsoft JhengHei" w:hAnsi="Microsoft JhengHei"/>
+          <w:b/>
+          <w:bCs/>
+          <w:color w:val="1F7A8C"/>
+          <w:sz w:val="20"/>
+          <w:szCs w:val="20"/>
+        </w:rPr>
+        <w:t xml:space="preserve">手動指令</w:t>
+      </w:r>
+    </w:p>
+    <w:p>
+      <w:pPr>
+        <w:pBdr>
+          <w:top w:val="none" w:color="FFFFFF" w:sz="0"/>
+          <w:left w:val="single" w:color="1F7A8C" w:sz="18" w:space="6"/>
+          <w:bottom w:val="none" w:color="FFFFFF" w:sz="0"/>
+          <w:right w:val="none" w:color="FFFFFF" w:sz="0"/>
+        </w:pBdr>
+        <w:shd w:fill="F1F4F7" w:color="auto" w:val="clear"/>
+        <w:spacing w:after="0" w:line="252"/>
+        <w:ind w:left="140" w:right="60"/>
+      </w:pPr>
+      <w:r>
+        <w:rPr>
+          <w:rFonts w:ascii="Consolas" w:cs="Consolas" w:eastAsia="Consolas" w:hAnsi="Consolas"/>
+          <w:color w:val="1B2733"/>
+          <w:sz w:val="17"/>
+          <w:szCs w:val="17"/>
+        </w:rPr>
+        <w:t xml:space="preserve">bash scripts/scram-delete-bug.sh</w:t>
+      </w:r>
+    </w:p>
+    <w:p>
+      <w:pPr>
+        <w:spacing w:after="80"/>
+      </w:pPr>
+    </w:p>
+    <w:p>
+      <w:pPr>
+        <w:spacing w:after="100" w:line="300"/>
+      </w:pPr>
+      <w:r>
+        <w:rPr>
+          <w:rFonts w:ascii="Microsoft JhengHei" w:cs="Microsoft JhengHei" w:eastAsia="Microsoft JhengHei" w:hAnsi="Microsoft JhengHei"/>
+          <w:b/>
+          <w:bCs/>
+          <w:color w:val="B7791F"/>
+          <w:sz w:val="21"/>
+          <w:szCs w:val="21"/>
+        </w:rPr>
+        <w:t xml:space="preserve">預期:</w:t>
+      </w:r>
+      <w:r>
+        <w:rPr>
+          <w:rFonts w:ascii="Microsoft JhengHei" w:cs="Microsoft JhengHei" w:eastAsia="Microsoft JhengHei" w:hAnsi="Microsoft JhengHei"/>
+          <w:sz w:val="21"/>
+          <w:szCs w:val="21"/>
+        </w:rPr>
+        <w:t xml:space="preserve">全新叢集:② 重啟後 svc-orders 登入 broker1 失敗、broker2 成功;③ 重建帳號再重啟後 broker1 成功;判定:已重現 KAFKA-20774…。跑過很多章節的環境可能是「判定:這次沒有重現」(bug 取決於 metadata 重放狀態),兩種都屬正常。約 3 到 4 分鐘。</w:t>
+      </w:r>
+    </w:p>
     <w:tbl>
       <w:tblPr>
         <w:tblW w:type="dxa" w:w="9026"/>
@@ -46688,6 +46781,71 @@
           <w:tcPr>
             <w:tcW w:type="dxa" w:w="9026"/>
             <w:tcBorders>
+              <w:top w:val="single" w:color="D5DEE6" w:sz="4"/>
+              <w:left w:val="single" w:color="B03A2E" w:sz="24"/>
+              <w:bottom w:val="single" w:color="D5DEE6" w:sz="4"/>
+              <w:right w:val="single" w:color="D5DEE6" w:sz="4"/>
+            </w:tcBorders>
+            <w:shd w:fill="FDECEA" w:color="auto" w:val="clear"/>
+            <w:tcMar>
+              <w:top w:type="dxa" w:w="80"/>
+              <w:left w:type="dxa" w:w="140"/>
+              <w:bottom w:type="dxa" w:w="80"/>
+              <w:right w:type="dxa" w:w="140"/>
+            </w:tcMar>
+          </w:tcPr>
+          <w:p>
+            <w:pPr>
+              <w:spacing w:after="0" w:line="288"/>
+            </w:pPr>
+            <w:r>
+              <w:rPr>
+                <w:rFonts w:ascii="Microsoft JhengHei" w:cs="Microsoft JhengHei" w:eastAsia="Microsoft JhengHei" w:hAnsi="Microsoft JhengHei"/>
+                <w:b/>
+                <w:bCs/>
+                <w:color w:val="B03A2E"/>
+                <w:sz w:val="20"/>
+                <w:szCs w:val="20"/>
+              </w:rPr>
+              <w:t xml:space="preserve">注意:</w:t>
+            </w:r>
+            <w:r>
+              <w:rPr>
+                <w:rFonts w:ascii="Microsoft JhengHei" w:cs="Microsoft JhengHei" w:eastAsia="Microsoft JhengHei" w:hAnsi="Microsoft JhengHei"/>
+                <w:sz w:val="20"/>
+                <w:szCs w:val="20"/>
+              </w:rPr>
+              <w:t xml:space="preserve">對客戶的說法:升到含修復的版本前,不要用 --delete-config 刪 SCRAM 帳號;停用 = 覆寫隨機密碼 + 解除 role binding;已經刪過就重建同名帳號再滾動重啟。對不存在的帳號執行刪除也會觸發(本專案舊版 reset.sh 就是這樣中的)。bug 連結與對照表在 RUNBOOK 第 19 章。</w:t>
+            </w:r>
+          </w:p>
+        </w:tc>
+      </w:tr>
+    </w:tbl>
+    <w:p>
+      <w:pPr>
+        <w:spacing w:after="80"/>
+      </w:pPr>
+    </w:p>
+    <w:tbl>
+      <w:tblPr>
+        <w:tblW w:type="dxa" w:w="9026"/>
+        <w:tblBorders>
+          <w:top w:val="single" w:color="auto" w:sz="4"/>
+          <w:left w:val="single" w:color="auto" w:sz="4"/>
+          <w:bottom w:val="single" w:color="auto" w:sz="4"/>
+          <w:right w:val="single" w:color="auto" w:sz="4"/>
+          <w:insideH w:val="single" w:color="auto" w:sz="4"/>
+          <w:insideV w:val="single" w:color="auto" w:sz="4"/>
+        </w:tblBorders>
+      </w:tblPr>
+      <w:tblGrid>
+        <w:gridCol w:w="9026"/>
+      </w:tblGrid>
+      <w:tr>
+        <w:tc>
+          <w:tcPr>
+            <w:tcW w:type="dxa" w:w="9026"/>
+            <w:tcBorders>
               <w:top w:val="single" w:color="DDD3EC" w:sz="4"/>
               <w:left w:val="single" w:color="6B4FA0" w:sz="30"/>
               <w:bottom w:val="single" w:color="DDD3EC" w:sz="4"/>
@@ -46808,7 +46966,7 @@
       <w:r>
         <w:drawing>
           <wp:inline distT="0" distB="0" distL="0" distR="0">
-            <wp:extent cx="5619750" cy="1866900"/>
+            <wp:extent cx="5619750" cy="2047875"/>
             <wp:effectExtent t="0" r="0" b="0" l="0"/>
             <wp:docPr id="21" name="labmap-20.png" descr="Lab 20 地圖:這堂要證明的事、動到的元件(打亮)、走的路與結果(✔ 允許 / ✘ 拒絕)" title="Lab 20 地圖:這堂要證明的事、動到的元件(打亮)、走的路與結果(✔ 允許 / ✘ 拒絕)"/>
             <wp:cNvGraphicFramePr>
@@ -46833,7 +46991,7 @@
                   <pic:spPr bwMode="auto">
                     <a:xfrm>
                       <a:off x="0" y="0"/>
-                      <a:ext cx="5619750" cy="1866900"/>
+                      <a:ext cx="5619750" cy="2047875"/>
                     </a:xfrm>
                     <a:prstGeom prst="rect">
                       <a:avLst/>
@@ -48485,6 +48643,164 @@
                 <w:szCs w:val="20"/>
               </w:rPr>
               <w:t xml:space="preserve">三個重點:① 沒有驗證:ENCRYPT 規則的實際加密、解密、金鑰輪替、效能,以及 KMS 對接(AWS / Azure / GCP / HashiCorp Vault 是官方支援的型態;沒有看到 CyberArk Conjur 或其他地端 KMS 的內建型態,地端要用自訂 KMS driver 或 Vault),都要在有授權的環境另外驗。② 要評估授權:企業版之外的加購授權,屬商務問題,不是技術設定。③ 危險的靜默失敗(測試時觀察到):如果 Schema Registry 沒有開 RuleSet extension,註冊帶規則的 schema 不會報錯,而是默默丟掉規則;之後 producer 照常寫入,卡號以明文落在 topic 裡(用一般 console consumer 讀原始位元組就看得到)。所以上線前一定要用「讀原始位元組」的方式確認欄位真的是密文,不能只看 producer 沒報錯。</w:t>
+            </w:r>
+          </w:p>
+        </w:tc>
+      </w:tr>
+    </w:tbl>
+    <w:p>
+      <w:pPr>
+        <w:spacing w:after="80"/>
+      </w:pPr>
+    </w:p>
+    <w:p>
+      <w:pPr>
+        <w:pStyle w:val="Heading3"/>
+        <w:keepNext/>
+      </w:pPr>
+      <w:r>
+        <w:rPr>
+          <w:rFonts w:ascii="Microsoft JhengHei" w:cs="Microsoft JhengHei" w:eastAsia="Microsoft JhengHei" w:hAnsi="Microsoft JhengHei"/>
+        </w:rPr>
+        <w:t xml:space="preserve">20.6 上線前的檢查習慣:讀 topic 的原始位元組,確認欄位到底有沒有被加密</w:t>
+      </w:r>
+    </w:p>
+    <w:p>
+      <w:pPr>
+        <w:spacing w:after="100" w:line="300"/>
+      </w:pPr>
+      <w:r>
+        <w:rPr>
+          <w:rFonts w:ascii="Microsoft JhengHei" w:cs="Microsoft JhengHei" w:eastAsia="Microsoft JhengHei" w:hAnsi="Microsoft JhengHei"/>
+          <w:sz w:val="21"/>
+          <w:szCs w:val="21"/>
+        </w:rPr>
+        <w:t xml:space="preserve">不要只看 producer 沒報錯。yujie 用 Avro(orders.events-value v1)寫一筆含卡號的訂單,再以一般 console consumer(bootstrap 身分)讀原始位元組找卡號。這個環境會看到明文——因為沒有 CSFLE 授權、規則不存在;正式環境若看到明文,就代表加密規則沒生效(例如 20.1 警告裡的靜默失敗)。</w:t>
+      </w:r>
+    </w:p>
+    <w:p>
+      <w:pPr>
+        <w:keepNext/>
+        <w:spacing w:after="60" w:before="120"/>
+      </w:pPr>
+      <w:r>
+        <w:rPr>
+          <w:rFonts w:ascii="Microsoft JhengHei" w:cs="Microsoft JhengHei" w:eastAsia="Microsoft JhengHei" w:hAnsi="Microsoft JhengHei"/>
+          <w:b/>
+          <w:bCs/>
+          <w:color w:val="1F7A8C"/>
+          <w:sz w:val="20"/>
+          <w:szCs w:val="20"/>
+        </w:rPr>
+        <w:t xml:space="preserve">手動指令</w:t>
+      </w:r>
+    </w:p>
+    <w:p>
+      <w:pPr>
+        <w:pBdr>
+          <w:top w:val="none" w:color="FFFFFF" w:sz="0"/>
+          <w:left w:val="single" w:color="1F7A8C" w:sz="18" w:space="6"/>
+          <w:bottom w:val="none" w:color="FFFFFF" w:sz="0"/>
+          <w:right w:val="none" w:color="FFFFFF" w:sz="0"/>
+        </w:pBdr>
+        <w:shd w:fill="F1F4F7" w:color="auto" w:val="clear"/>
+        <w:spacing w:after="0" w:line="252"/>
+        <w:ind w:left="140" w:right="60"/>
+      </w:pPr>
+      <w:r>
+        <w:rPr>
+          <w:rFonts w:ascii="Consolas" w:cs="Consolas" w:eastAsia="Consolas" w:hAnsi="Consolas"/>
+          <w:color w:val="1B2733"/>
+          <w:sz w:val="17"/>
+          <w:szCs w:val="17"/>
+        </w:rPr>
+        <w:t xml:space="preserve">bash scripts/sr-raw-check.sh</w:t>
+      </w:r>
+    </w:p>
+    <w:p>
+      <w:pPr>
+        <w:spacing w:after="80"/>
+      </w:pPr>
+    </w:p>
+    <w:p>
+      <w:pPr>
+        <w:spacing w:after="100" w:line="300"/>
+      </w:pPr>
+      <w:r>
+        <w:rPr>
+          <w:rFonts w:ascii="Microsoft JhengHei" w:cs="Microsoft JhengHei" w:eastAsia="Microsoft JhengHei" w:hAnsi="Microsoft JhengHei"/>
+          <w:b/>
+          <w:bCs/>
+          <w:color w:val="B7791F"/>
+          <w:sz w:val="21"/>
+          <w:szCs w:val="21"/>
+        </w:rPr>
+        <w:t xml:space="preserve">預期:</w:t>
+      </w:r>
+      <w:r>
+        <w:rPr>
+          <w:rFonts w:ascii="Microsoft JhengHei" w:cs="Microsoft JhengHei" w:eastAsia="Microsoft JhengHei" w:hAnsi="Microsoft JhengHei"/>
+          <w:sz w:val="21"/>
+          <w:szCs w:val="21"/>
+        </w:rPr>
+        <w:t xml:space="preserve">① 寫入完成(producer 沒有報錯);② od -c 看得到卡號字串;判定:topic 裡的卡號是明文。</w:t>
+      </w:r>
+    </w:p>
+    <w:tbl>
+      <w:tblPr>
+        <w:tblW w:type="dxa" w:w="9026"/>
+        <w:tblBorders>
+          <w:top w:val="single" w:color="auto" w:sz="4"/>
+          <w:left w:val="single" w:color="auto" w:sz="4"/>
+          <w:bottom w:val="single" w:color="auto" w:sz="4"/>
+          <w:right w:val="single" w:color="auto" w:sz="4"/>
+          <w:insideH w:val="single" w:color="auto" w:sz="4"/>
+          <w:insideV w:val="single" w:color="auto" w:sz="4"/>
+        </w:tblBorders>
+      </w:tblPr>
+      <w:tblGrid>
+        <w:gridCol w:w="9026"/>
+      </w:tblGrid>
+      <w:tr>
+        <w:tc>
+          <w:tcPr>
+            <w:tcW w:type="dxa" w:w="9026"/>
+            <w:tcBorders>
+              <w:top w:val="single" w:color="D5DEE6" w:sz="4"/>
+              <w:left w:val="single" w:color="B03A2E" w:sz="24"/>
+              <w:bottom w:val="single" w:color="D5DEE6" w:sz="4"/>
+              <w:right w:val="single" w:color="D5DEE6" w:sz="4"/>
+            </w:tcBorders>
+            <w:shd w:fill="FDECEA" w:color="auto" w:val="clear"/>
+            <w:tcMar>
+              <w:top w:type="dxa" w:w="80"/>
+              <w:left w:type="dxa" w:w="140"/>
+              <w:bottom w:type="dxa" w:w="80"/>
+              <w:right w:type="dxa" w:w="140"/>
+            </w:tcMar>
+          </w:tcPr>
+          <w:p>
+            <w:pPr>
+              <w:spacing w:after="0" w:line="288"/>
+            </w:pPr>
+            <w:r>
+              <w:rPr>
+                <w:rFonts w:ascii="Microsoft JhengHei" w:cs="Microsoft JhengHei" w:eastAsia="Microsoft JhengHei" w:hAnsi="Microsoft JhengHei"/>
+                <w:b/>
+                <w:bCs/>
+                <w:color w:val="B03A2E"/>
+                <w:sz w:val="20"/>
+                <w:szCs w:val="20"/>
+              </w:rPr>
+              <w:t xml:space="preserve">注意:</w:t>
+            </w:r>
+            <w:r>
+              <w:rPr>
+                <w:rFonts w:ascii="Microsoft JhengHei" w:cs="Microsoft JhengHei" w:eastAsia="Microsoft JhengHei" w:hAnsi="Microsoft JhengHei"/>
+                <w:sz w:val="20"/>
+                <w:szCs w:val="20"/>
+              </w:rPr>
+              <w:t xml:space="preserve">把這個檢查做成上線前與每次改 schema 規則後的固定步驟;有授權的環境應該看到密文(base64 的 ciphertext),看到明文就是事故。</w:t>
             </w:r>
           </w:p>
         </w:tc>

</xml_diff>